<commit_message>
Add paper summaries to guide literature review
</commit_message>
<xml_diff>
--- a/outputs/guide_review_pack/02_compact_literature_review_summary.docx
+++ b/outputs/guide_review_pack/02_compact_literature_review_summary.docx
@@ -773,6 +773,3271 @@
         <w:t>The strongest working direction is explainable and personalized IVF outcome prediction with a clinical decision-support framing. The final title should remain open until clinic data feasibility is confirmed.</w:t>
       </w:r>
     </w:p>
+    <w:p>
+      <w:r>
+        <w:br w:type="page"/>
+      </w:r>
+    </w:p>
+    <w:p>
+      <w:pPr>
+        <w:pStyle w:val="Heading1"/>
+      </w:pPr>
+      <w:r>
+        <w:t>Paper-Wise Compact Summary</w:t>
+      </w:r>
+    </w:p>
+    <w:p>
+      <w:r>
+        <w:t>This section gives a compact guide-facing summary of the current 35 reviewed papers. It is derived from the working literature matrix; full extraction fields remain in the Excel workbook and paper-wise notes.</w:t>
+      </w:r>
+    </w:p>
+    <w:tbl>
+      <w:tblPr>
+        <w:tblStyle w:val="TableGrid"/>
+        <w:tblW w:type="auto" w:w="0"/>
+        <w:jc w:val="center"/>
+        <w:tblLook w:firstColumn="1" w:firstRow="1" w:lastColumn="0" w:lastRow="0" w:noHBand="0" w:noVBand="1" w:val="04A0"/>
+      </w:tblPr>
+      <w:tblGrid>
+        <w:gridCol w:w="2340"/>
+        <w:gridCol w:w="2340"/>
+        <w:gridCol w:w="2340"/>
+        <w:gridCol w:w="2340"/>
+      </w:tblGrid>
+      <w:tr>
+        <w:tc>
+          <w:tcPr>
+            <w:tcW w:type="dxa" w:w="2340"/>
+            <w:shd w:fill="F2F4F7"/>
+          </w:tcPr>
+          <w:p>
+            <w:pPr>
+              <w:spacing w:after="0"/>
+            </w:pPr>
+            <w:r/>
+            <w:r>
+              <w:rPr>
+                <w:rFonts w:ascii="Calibri" w:hAnsi="Calibri"/>
+                <w:b/>
+                <w:sz w:val="16"/>
+              </w:rPr>
+              <w:t>Paper</w:t>
+            </w:r>
+          </w:p>
+        </w:tc>
+        <w:tc>
+          <w:tcPr>
+            <w:tcW w:type="dxa" w:w="2340"/>
+            <w:shd w:fill="F2F4F7"/>
+          </w:tcPr>
+          <w:p>
+            <w:pPr>
+              <w:spacing w:after="0"/>
+            </w:pPr>
+            <w:r/>
+            <w:r>
+              <w:rPr>
+                <w:rFonts w:ascii="Calibri" w:hAnsi="Calibri"/>
+                <w:b/>
+                <w:sz w:val="16"/>
+              </w:rPr>
+              <w:t>Focus and Method</w:t>
+            </w:r>
+          </w:p>
+        </w:tc>
+        <w:tc>
+          <w:tcPr>
+            <w:tcW w:type="dxa" w:w="2340"/>
+            <w:shd w:fill="F2F4F7"/>
+          </w:tcPr>
+          <w:p>
+            <w:pPr>
+              <w:spacing w:after="0"/>
+            </w:pPr>
+            <w:r/>
+            <w:r>
+              <w:rPr>
+                <w:rFonts w:ascii="Calibri" w:hAnsi="Calibri"/>
+                <w:b/>
+                <w:sz w:val="16"/>
+              </w:rPr>
+              <w:t>Dataset / Evidence</w:t>
+            </w:r>
+          </w:p>
+        </w:tc>
+        <w:tc>
+          <w:tcPr>
+            <w:tcW w:type="dxa" w:w="2340"/>
+            <w:shd w:fill="F2F4F7"/>
+          </w:tcPr>
+          <w:p>
+            <w:pPr>
+              <w:spacing w:after="0"/>
+            </w:pPr>
+            <w:r/>
+            <w:r>
+              <w:rPr>
+                <w:rFonts w:ascii="Calibri" w:hAnsi="Calibri"/>
+                <w:b/>
+                <w:sz w:val="16"/>
+              </w:rPr>
+              <w:t>Main Gap / Use</w:t>
+            </w:r>
+          </w:p>
+        </w:tc>
+      </w:tr>
+      <w:tr>
+        <w:tc>
+          <w:tcPr>
+            <w:tcW w:type="dxa" w:w="2340"/>
+            <w:vAlign w:val="top"/>
+          </w:tcPr>
+          <w:p>
+            <w:pPr>
+              <w:spacing w:after="0"/>
+            </w:pPr>
+            <w:r/>
+            <w:r>
+              <w:rPr>
+                <w:rFonts w:ascii="Calibri" w:hAnsi="Calibri"/>
+                <w:b w:val="0"/>
+                <w:sz w:val="16"/>
+              </w:rPr>
+              <w:t>Paper 1 (2025)</w:t>
+              <w:br/>
+              <w:t>Explainable artificial intelligence to identify follicles that optimize clinical outcomes during assisted conception</w:t>
+              <w:br/>
+              <w:t>Nature Communications</w:t>
+            </w:r>
+          </w:p>
+        </w:tc>
+        <w:tc>
+          <w:tcPr>
+            <w:tcW w:type="dxa" w:w="2340"/>
+            <w:vAlign w:val="top"/>
+          </w:tcPr>
+          <w:p>
+            <w:pPr>
+              <w:spacing w:after="0"/>
+            </w:pPr>
+            <w:r/>
+            <w:r>
+              <w:rPr>
+                <w:rFonts w:ascii="Calibri" w:hAnsi="Calibri"/>
+                <w:b w:val="0"/>
+                <w:sz w:val="16"/>
+              </w:rPr>
+              <w:t>Use XAI/ML to identify follicle-size ranges associated with mature oocytes and downstream IVF outcomes.</w:t>
+              <w:br/>
+              <w:t>Method: Histogram-based gradient boosting regression tree; permutation importance; SHAP; logistic regression for live birth associations.</w:t>
+            </w:r>
+          </w:p>
+        </w:tc>
+        <w:tc>
+          <w:tcPr>
+            <w:tcW w:type="dxa" w:w="2340"/>
+            <w:vAlign w:val="top"/>
+          </w:tcPr>
+          <w:p>
+            <w:pPr>
+              <w:spacing w:after="0"/>
+            </w:pPr>
+            <w:r/>
+            <w:r>
+              <w:rPr>
+                <w:rFonts w:ascii="Calibri" w:hAnsi="Calibri"/>
+                <w:b w:val="0"/>
+                <w:sz w:val="16"/>
+              </w:rPr>
+              <w:t>19,082 treatment-naive female patients from 11 European IVF centers.</w:t>
+            </w:r>
+          </w:p>
+        </w:tc>
+        <w:tc>
+          <w:tcPr>
+            <w:tcW w:type="dxa" w:w="2340"/>
+            <w:vAlign w:val="top"/>
+          </w:tcPr>
+          <w:p>
+            <w:pPr>
+              <w:spacing w:after="0"/>
+            </w:pPr>
+            <w:r/>
+            <w:r>
+              <w:rPr>
+                <w:rFonts w:ascii="Calibri" w:hAnsi="Calibri"/>
+                <w:b w:val="0"/>
+                <w:sz w:val="16"/>
+              </w:rPr>
+              <w:t>Need Prospective/RCT Validation; Need Clinical Decision Support; External/Indian Validation Gap</w:t>
+              <w:br/>
+              <w:t>Relevance: High</w:t>
+            </w:r>
+          </w:p>
+        </w:tc>
+      </w:tr>
+      <w:tr>
+        <w:tc>
+          <w:tcPr>
+            <w:tcW w:type="dxa" w:w="2340"/>
+            <w:vAlign w:val="top"/>
+          </w:tcPr>
+          <w:p>
+            <w:pPr>
+              <w:spacing w:after="0"/>
+            </w:pPr>
+            <w:r/>
+            <w:r>
+              <w:rPr>
+                <w:rFonts w:ascii="Calibri" w:hAnsi="Calibri"/>
+                <w:b w:val="0"/>
+                <w:sz w:val="16"/>
+              </w:rPr>
+              <w:t>Paper 2 (2024)</w:t>
+              <w:br/>
+              <w:t>Optimizing oocyte yield utilizing a machine learning model for dose and trigger decisions, a multi-center, prospective study</w:t>
+              <w:br/>
+              <w:t>Scientific Reports</w:t>
+            </w:r>
+          </w:p>
+        </w:tc>
+        <w:tc>
+          <w:tcPr>
+            <w:tcW w:type="dxa" w:w="2340"/>
+            <w:vAlign w:val="top"/>
+          </w:tcPr>
+          <w:p>
+            <w:pPr>
+              <w:spacing w:after="0"/>
+            </w:pPr>
+            <w:r/>
+            <w:r>
+              <w:rPr>
+                <w:rFonts w:ascii="Calibri" w:hAnsi="Calibri"/>
+                <w:b w:val="0"/>
+                <w:sz w:val="16"/>
+              </w:rPr>
+              <w:t>Evaluate clinical outcomes when clinicians use an AI platform for starting FSH dose and trigger-timing decisions.</w:t>
+              <w:br/>
+              <w:t>Method: Commercial/clinical ML decision-support tools for starting dose and trigger timing.</w:t>
+            </w:r>
+          </w:p>
+        </w:tc>
+        <w:tc>
+          <w:tcPr>
+            <w:tcW w:type="dxa" w:w="2340"/>
+            <w:vAlign w:val="top"/>
+          </w:tcPr>
+          <w:p>
+            <w:pPr>
+              <w:spacing w:after="0"/>
+            </w:pPr>
+            <w:r/>
+            <w:r>
+              <w:rPr>
+                <w:rFonts w:ascii="Calibri" w:hAnsi="Calibri"/>
+                <w:b w:val="0"/>
+                <w:sz w:val="16"/>
+              </w:rPr>
+              <w:t>Prospective study with historical propensity-matched control; two US clinics, four physicians.</w:t>
+            </w:r>
+          </w:p>
+        </w:tc>
+        <w:tc>
+          <w:tcPr>
+            <w:tcW w:type="dxa" w:w="2340"/>
+            <w:vAlign w:val="top"/>
+          </w:tcPr>
+          <w:p>
+            <w:pPr>
+              <w:spacing w:after="0"/>
+            </w:pPr>
+            <w:r/>
+            <w:r>
+              <w:rPr>
+                <w:rFonts w:ascii="Calibri" w:hAnsi="Calibri"/>
+                <w:b w:val="0"/>
+                <w:sz w:val="16"/>
+              </w:rPr>
+              <w:t>Need Prospective/RCT Validation; Small Dataset; Limited Multi-center Validation; Need Real-world Deployment Evidence</w:t>
+              <w:br/>
+              <w:t>Relevance: High</w:t>
+            </w:r>
+          </w:p>
+        </w:tc>
+      </w:tr>
+      <w:tr>
+        <w:tc>
+          <w:tcPr>
+            <w:tcW w:type="dxa" w:w="2340"/>
+            <w:vAlign w:val="top"/>
+          </w:tcPr>
+          <w:p>
+            <w:pPr>
+              <w:spacing w:after="0"/>
+            </w:pPr>
+            <w:r/>
+            <w:r>
+              <w:rPr>
+                <w:rFonts w:ascii="Calibri" w:hAnsi="Calibri"/>
+                <w:b w:val="0"/>
+                <w:sz w:val="16"/>
+              </w:rPr>
+              <w:t>Paper 3 (2026)</w:t>
+              <w:br/>
+              <w:t>Multimodal intelligent prediction model for in vitro fertilization</w:t>
+              <w:br/>
+              <w:t>npj Digital Medicine</w:t>
+            </w:r>
+          </w:p>
+        </w:tc>
+        <w:tc>
+          <w:tcPr>
+            <w:tcW w:type="dxa" w:w="2340"/>
+            <w:vAlign w:val="top"/>
+          </w:tcPr>
+          <w:p>
+            <w:pPr>
+              <w:spacing w:after="0"/>
+            </w:pPr>
+            <w:r/>
+            <w:r>
+              <w:rPr>
+                <w:rFonts w:ascii="Calibri" w:hAnsi="Calibri"/>
+                <w:b w:val="0"/>
+                <w:sz w:val="16"/>
+              </w:rPr>
+              <w:t>Develop a multimodal IVF prediction model integrating embryo time-lapse imagery and clinical factors.</w:t>
+              <w:br/>
+              <w:t>Method: Multimodal deep learning model for post-transfer outcome prediction.</w:t>
+            </w:r>
+          </w:p>
+        </w:tc>
+        <w:tc>
+          <w:tcPr>
+            <w:tcW w:type="dxa" w:w="2340"/>
+            <w:vAlign w:val="top"/>
+          </w:tcPr>
+          <w:p>
+            <w:pPr>
+              <w:spacing w:after="0"/>
+            </w:pPr>
+            <w:r/>
+            <w:r>
+              <w:rPr>
+                <w:rFonts w:ascii="Calibri" w:hAnsi="Calibri"/>
+                <w:b w:val="0"/>
+                <w:sz w:val="16"/>
+              </w:rPr>
+              <w:t>Chinese IVF data; day-3 transferred embryos only.</w:t>
+            </w:r>
+          </w:p>
+        </w:tc>
+        <w:tc>
+          <w:tcPr>
+            <w:tcW w:type="dxa" w:w="2340"/>
+            <w:vAlign w:val="top"/>
+          </w:tcPr>
+          <w:p>
+            <w:pPr>
+              <w:spacing w:after="0"/>
+            </w:pPr>
+            <w:r/>
+            <w:r>
+              <w:rPr>
+                <w:rFonts w:ascii="Calibri" w:hAnsi="Calibri"/>
+                <w:b w:val="0"/>
+                <w:sz w:val="16"/>
+              </w:rPr>
+              <w:t>Need External Validation; Limited Population Diversity; No Pre-transfer Recommendation; Retrospective Design</w:t>
+              <w:br/>
+              <w:t>Relevance: High, but outside original 2021-2025 window</w:t>
+            </w:r>
+          </w:p>
+        </w:tc>
+      </w:tr>
+      <w:tr>
+        <w:tc>
+          <w:tcPr>
+            <w:tcW w:type="dxa" w:w="2340"/>
+            <w:vAlign w:val="top"/>
+          </w:tcPr>
+          <w:p>
+            <w:pPr>
+              <w:spacing w:after="0"/>
+            </w:pPr>
+            <w:r/>
+            <w:r>
+              <w:rPr>
+                <w:rFonts w:ascii="Calibri" w:hAnsi="Calibri"/>
+                <w:b w:val="0"/>
+                <w:sz w:val="16"/>
+              </w:rPr>
+              <w:t>Paper 4 (2025)</w:t>
+              <w:br/>
+              <w:t>Deep learning classification integrating embryo images with associated clinical information from ART cycles</w:t>
+              <w:br/>
+              <w:t>Scientific Reports</w:t>
+            </w:r>
+          </w:p>
+        </w:tc>
+        <w:tc>
+          <w:tcPr>
+            <w:tcW w:type="dxa" w:w="2340"/>
+            <w:vAlign w:val="top"/>
+          </w:tcPr>
+          <w:p>
+            <w:pPr>
+              <w:spacing w:after="0"/>
+            </w:pPr>
+            <w:r/>
+            <w:r>
+              <w:rPr>
+                <w:rFonts w:ascii="Calibri" w:hAnsi="Calibri"/>
+                <w:b w:val="0"/>
+                <w:sz w:val="16"/>
+              </w:rPr>
+              <w:t>Test whether embryo-image models improve when combined with patient clinical information.</w:t>
+              <w:br/>
+              <w:t>Method: Deep learning image model with clinical-data fusion.</w:t>
+            </w:r>
+          </w:p>
+        </w:tc>
+        <w:tc>
+          <w:tcPr>
+            <w:tcW w:type="dxa" w:w="2340"/>
+            <w:vAlign w:val="top"/>
+          </w:tcPr>
+          <w:p>
+            <w:pPr>
+              <w:spacing w:after="0"/>
+            </w:pPr>
+            <w:r/>
+            <w:r>
+              <w:rPr>
+                <w:rFonts w:ascii="Calibri" w:hAnsi="Calibri"/>
+                <w:b w:val="0"/>
+                <w:sz w:val="16"/>
+              </w:rPr>
+              <w:t>Embryo images and associated ART-cycle clinical data; transferred embryos only; limited database.</w:t>
+            </w:r>
+          </w:p>
+        </w:tc>
+        <w:tc>
+          <w:tcPr>
+            <w:tcW w:type="dxa" w:w="2340"/>
+            <w:vAlign w:val="top"/>
+          </w:tcPr>
+          <w:p>
+            <w:pPr>
+              <w:spacing w:after="0"/>
+            </w:pPr>
+            <w:r/>
+            <w:r>
+              <w:rPr>
+                <w:rFonts w:ascii="Calibri" w:hAnsi="Calibri"/>
+                <w:b w:val="0"/>
+                <w:sz w:val="16"/>
+              </w:rPr>
+              <w:t>Small Dataset; Selection Bias; Need Multimodal Data; No Pre-transfer Recommendation</w:t>
+              <w:br/>
+              <w:t>Relevance: High</w:t>
+            </w:r>
+          </w:p>
+        </w:tc>
+      </w:tr>
+      <w:tr>
+        <w:tc>
+          <w:tcPr>
+            <w:tcW w:type="dxa" w:w="2340"/>
+            <w:vAlign w:val="top"/>
+          </w:tcPr>
+          <w:p>
+            <w:pPr>
+              <w:spacing w:after="0"/>
+            </w:pPr>
+            <w:r/>
+            <w:r>
+              <w:rPr>
+                <w:rFonts w:ascii="Calibri" w:hAnsi="Calibri"/>
+                <w:b w:val="0"/>
+                <w:sz w:val="16"/>
+              </w:rPr>
+              <w:t>Paper 5 (2025)</w:t>
+              <w:br/>
+              <w:t>Machine learning center-specific models show improved IVF live birth predictions over US national registry-based model</w:t>
+              <w:br/>
+              <w:t>Nature Communications</w:t>
+            </w:r>
+          </w:p>
+        </w:tc>
+        <w:tc>
+          <w:tcPr>
+            <w:tcW w:type="dxa" w:w="2340"/>
+            <w:vAlign w:val="top"/>
+          </w:tcPr>
+          <w:p>
+            <w:pPr>
+              <w:spacing w:after="0"/>
+            </w:pPr>
+            <w:r/>
+            <w:r>
+              <w:rPr>
+                <w:rFonts w:ascii="Calibri" w:hAnsi="Calibri"/>
+                <w:b w:val="0"/>
+                <w:sz w:val="16"/>
+              </w:rPr>
+              <w:t>Compare center-specific ML live-birth prediction with a national registry-based model.</w:t>
+              <w:br/>
+              <w:t>Method: Center-specific machine learning live-birth prediction models.</w:t>
+            </w:r>
+          </w:p>
+        </w:tc>
+        <w:tc>
+          <w:tcPr>
+            <w:tcW w:type="dxa" w:w="2340"/>
+            <w:vAlign w:val="top"/>
+          </w:tcPr>
+          <w:p>
+            <w:pPr>
+              <w:spacing w:after="0"/>
+            </w:pPr>
+            <w:r/>
+            <w:r>
+              <w:rPr>
+                <w:rFonts w:ascii="Calibri" w:hAnsi="Calibri"/>
+                <w:b w:val="0"/>
+                <w:sz w:val="16"/>
+              </w:rPr>
+              <w:t>4,635 first-IVF-cycle patients from six centers.</w:t>
+            </w:r>
+          </w:p>
+        </w:tc>
+        <w:tc>
+          <w:tcPr>
+            <w:tcW w:type="dxa" w:w="2340"/>
+            <w:vAlign w:val="top"/>
+          </w:tcPr>
+          <w:p>
+            <w:pPr>
+              <w:spacing w:after="0"/>
+            </w:pPr>
+            <w:r/>
+            <w:r>
+              <w:rPr>
+                <w:rFonts w:ascii="Calibri" w:hAnsi="Calibri"/>
+                <w:b w:val="0"/>
+                <w:sz w:val="16"/>
+              </w:rPr>
+              <w:t>Limited Population Diversity; No Indian Population; Generalization Gap; Need External Validation</w:t>
+              <w:br/>
+              <w:t>Relevance: High</w:t>
+            </w:r>
+          </w:p>
+        </w:tc>
+      </w:tr>
+      <w:tr>
+        <w:tc>
+          <w:tcPr>
+            <w:tcW w:type="dxa" w:w="2340"/>
+            <w:vAlign w:val="top"/>
+          </w:tcPr>
+          <w:p>
+            <w:pPr>
+              <w:spacing w:after="0"/>
+            </w:pPr>
+            <w:r/>
+            <w:r>
+              <w:rPr>
+                <w:rFonts w:ascii="Calibri" w:hAnsi="Calibri"/>
+                <w:b w:val="0"/>
+                <w:sz w:val="16"/>
+              </w:rPr>
+              <w:t>Paper 6 (2025)</w:t>
+              <w:br/>
+              <w:t>Predictive modeling of pregnancy outcomes utilizing multiple machine learning techniques for IVF-ET</w:t>
+              <w:br/>
+              <w:t>BMC Pregnancy and Childbirth</w:t>
+            </w:r>
+          </w:p>
+        </w:tc>
+        <w:tc>
+          <w:tcPr>
+            <w:tcW w:type="dxa" w:w="2340"/>
+            <w:vAlign w:val="top"/>
+          </w:tcPr>
+          <w:p>
+            <w:pPr>
+              <w:spacing w:after="0"/>
+            </w:pPr>
+            <w:r/>
+            <w:r>
+              <w:rPr>
+                <w:rFonts w:ascii="Calibri" w:hAnsi="Calibri"/>
+                <w:b w:val="0"/>
+                <w:sz w:val="16"/>
+              </w:rPr>
+              <w:t>Identify factors influencing pregnancy outcomes and compare ML models for IVF-ET prediction.</w:t>
+              <w:br/>
+              <w:t>Method: Multiple ML models; 80:20 train-test split.</w:t>
+            </w:r>
+          </w:p>
+        </w:tc>
+        <w:tc>
+          <w:tcPr>
+            <w:tcW w:type="dxa" w:w="2340"/>
+            <w:vAlign w:val="top"/>
+          </w:tcPr>
+          <w:p>
+            <w:pPr>
+              <w:spacing w:after="0"/>
+            </w:pPr>
+            <w:r/>
+            <w:r>
+              <w:rPr>
+                <w:rFonts w:ascii="Calibri" w:hAnsi="Calibri"/>
+                <w:b w:val="0"/>
+                <w:sz w:val="16"/>
+              </w:rPr>
+              <w:t>2,625 women undergoing fresh IVF-ET cycles from 2016-2022 at Inner Mongolia Medical University affiliated hospital.</w:t>
+            </w:r>
+          </w:p>
+        </w:tc>
+        <w:tc>
+          <w:tcPr>
+            <w:tcW w:type="dxa" w:w="2340"/>
+            <w:vAlign w:val="top"/>
+          </w:tcPr>
+          <w:p>
+            <w:pPr>
+              <w:spacing w:after="0"/>
+            </w:pPr>
+            <w:r/>
+            <w:r>
+              <w:rPr>
+                <w:rFonts w:ascii="Calibri" w:hAnsi="Calibri"/>
+                <w:b w:val="0"/>
+                <w:sz w:val="16"/>
+              </w:rPr>
+              <w:t>Single-center Study; Need External Validation; Retrospective Design; Need Clinical Decision Support</w:t>
+              <w:br/>
+              <w:t>Relevance: High</w:t>
+            </w:r>
+          </w:p>
+        </w:tc>
+      </w:tr>
+      <w:tr>
+        <w:tc>
+          <w:tcPr>
+            <w:tcW w:type="dxa" w:w="2340"/>
+            <w:vAlign w:val="top"/>
+          </w:tcPr>
+          <w:p>
+            <w:pPr>
+              <w:spacing w:after="0"/>
+            </w:pPr>
+            <w:r/>
+            <w:r>
+              <w:rPr>
+                <w:rFonts w:ascii="Calibri" w:hAnsi="Calibri"/>
+                <w:b w:val="0"/>
+                <w:sz w:val="16"/>
+              </w:rPr>
+              <w:t>Paper 7 (2025)</w:t>
+              <w:br/>
+              <w:t>Construction and evaluation of machine learning-based prediction model for live birth following fresh embryo transfer in IVF/ICSI patients with PCOS</w:t>
+              <w:br/>
+              <w:t>Journal of Ovarian Research</w:t>
+            </w:r>
+          </w:p>
+        </w:tc>
+        <w:tc>
+          <w:tcPr>
+            <w:tcW w:type="dxa" w:w="2340"/>
+            <w:vAlign w:val="top"/>
+          </w:tcPr>
+          <w:p>
+            <w:pPr>
+              <w:spacing w:after="0"/>
+            </w:pPr>
+            <w:r/>
+            <w:r>
+              <w:rPr>
+                <w:rFonts w:ascii="Calibri" w:hAnsi="Calibri"/>
+                <w:b w:val="0"/>
+                <w:sz w:val="16"/>
+              </w:rPr>
+              <w:t>Predict live birth after fresh embryo transfer among PCOS patients using ML algorithms.</w:t>
+              <w:br/>
+              <w:t>Method: Multiple ML algorithms; XGBoost best; SHAP for predictors.</w:t>
+            </w:r>
+          </w:p>
+        </w:tc>
+        <w:tc>
+          <w:tcPr>
+            <w:tcW w:type="dxa" w:w="2340"/>
+            <w:vAlign w:val="top"/>
+          </w:tcPr>
+          <w:p>
+            <w:pPr>
+              <w:spacing w:after="0"/>
+            </w:pPr>
+            <w:r/>
+            <w:r>
+              <w:rPr>
+                <w:rFonts w:ascii="Calibri" w:hAnsi="Calibri"/>
+                <w:b w:val="0"/>
+                <w:sz w:val="16"/>
+              </w:rPr>
+              <w:t>1,062 fresh embryo transfer cycles in PCOS patients; 466 live births.</w:t>
+            </w:r>
+          </w:p>
+        </w:tc>
+        <w:tc>
+          <w:tcPr>
+            <w:tcW w:type="dxa" w:w="2340"/>
+            <w:vAlign w:val="top"/>
+          </w:tcPr>
+          <w:p>
+            <w:pPr>
+              <w:spacing w:after="0"/>
+            </w:pPr>
+            <w:r/>
+            <w:r>
+              <w:rPr>
+                <w:rFonts w:ascii="Calibri" w:hAnsi="Calibri"/>
+                <w:b w:val="0"/>
+                <w:sz w:val="16"/>
+              </w:rPr>
+              <w:t>Need External Validation; Disease-specific Generalization Gap; Need Clinical Decision Support</w:t>
+              <w:br/>
+              <w:t>Relevance: Medium-High</w:t>
+            </w:r>
+          </w:p>
+        </w:tc>
+      </w:tr>
+      <w:tr>
+        <w:tc>
+          <w:tcPr>
+            <w:tcW w:type="dxa" w:w="2340"/>
+            <w:vAlign w:val="top"/>
+          </w:tcPr>
+          <w:p>
+            <w:pPr>
+              <w:spacing w:after="0"/>
+            </w:pPr>
+            <w:r/>
+            <w:r>
+              <w:rPr>
+                <w:rFonts w:ascii="Calibri" w:hAnsi="Calibri"/>
+                <w:b w:val="0"/>
+                <w:sz w:val="16"/>
+              </w:rPr>
+              <w:t>Paper 8 (2025)</w:t>
+              <w:br/>
+              <w:t>Predictive models for live birth outcomes following fresh embryo transfer</w:t>
+              <w:br/>
+              <w:t>Journal of Translational Medicine</w:t>
+            </w:r>
+          </w:p>
+        </w:tc>
+        <w:tc>
+          <w:tcPr>
+            <w:tcW w:type="dxa" w:w="2340"/>
+            <w:vAlign w:val="top"/>
+          </w:tcPr>
+          <w:p>
+            <w:pPr>
+              <w:spacing w:after="0"/>
+            </w:pPr>
+            <w:r/>
+            <w:r>
+              <w:rPr>
+                <w:rFonts w:ascii="Calibri" w:hAnsi="Calibri"/>
+                <w:b w:val="0"/>
+                <w:sz w:val="16"/>
+              </w:rPr>
+              <w:t>Develop ML prediction models for live birth before embryo transfer.</w:t>
+              <w:br/>
+              <w:t>Method: Machine learning prediction models.</w:t>
+            </w:r>
+          </w:p>
+        </w:tc>
+        <w:tc>
+          <w:tcPr>
+            <w:tcW w:type="dxa" w:w="2340"/>
+            <w:vAlign w:val="top"/>
+          </w:tcPr>
+          <w:p>
+            <w:pPr>
+              <w:spacing w:after="0"/>
+            </w:pPr>
+            <w:r/>
+            <w:r>
+              <w:rPr>
+                <w:rFonts w:ascii="Calibri" w:hAnsi="Calibri"/>
+                <w:b w:val="0"/>
+                <w:sz w:val="16"/>
+              </w:rPr>
+              <w:t>Fresh embryo-transfer cohort; exact size not extracted in first pass.</w:t>
+            </w:r>
+          </w:p>
+        </w:tc>
+        <w:tc>
+          <w:tcPr>
+            <w:tcW w:type="dxa" w:w="2340"/>
+            <w:vAlign w:val="top"/>
+          </w:tcPr>
+          <w:p>
+            <w:pPr>
+              <w:spacing w:after="0"/>
+            </w:pPr>
+            <w:r/>
+            <w:r>
+              <w:rPr>
+                <w:rFonts w:ascii="Calibri" w:hAnsi="Calibri"/>
+                <w:b w:val="0"/>
+                <w:sz w:val="16"/>
+              </w:rPr>
+              <w:t>Need External Validation; Need Clinical Decision Support; Need Real-world Deployment Evidence</w:t>
+              <w:br/>
+              <w:t>Relevance: Medium-High</w:t>
+            </w:r>
+          </w:p>
+        </w:tc>
+      </w:tr>
+      <w:tr>
+        <w:tc>
+          <w:tcPr>
+            <w:tcW w:type="dxa" w:w="2340"/>
+            <w:vAlign w:val="top"/>
+          </w:tcPr>
+          <w:p>
+            <w:pPr>
+              <w:spacing w:after="0"/>
+            </w:pPr>
+            <w:r/>
+            <w:r>
+              <w:rPr>
+                <w:rFonts w:ascii="Calibri" w:hAnsi="Calibri"/>
+                <w:b w:val="0"/>
+                <w:sz w:val="16"/>
+              </w:rPr>
+              <w:t>Paper 9 (2025)</w:t>
+              <w:br/>
+              <w:t>A retrospective analysis of 48,514 IVF cycles and an evaluation of machine learning models for live birth prediction</w:t>
+              <w:br/>
+              <w:t>Frontiers in Endocrinology</w:t>
+            </w:r>
+          </w:p>
+        </w:tc>
+        <w:tc>
+          <w:tcPr>
+            <w:tcW w:type="dxa" w:w="2340"/>
+            <w:vAlign w:val="top"/>
+          </w:tcPr>
+          <w:p>
+            <w:pPr>
+              <w:spacing w:after="0"/>
+            </w:pPr>
+            <w:r/>
+            <w:r>
+              <w:rPr>
+                <w:rFonts w:ascii="Calibri" w:hAnsi="Calibri"/>
+                <w:b w:val="0"/>
+                <w:sz w:val="16"/>
+              </w:rPr>
+              <w:t>Compare CNN and traditional ML models for live-birth prediction and assess feasibility in resource-limited settings.</w:t>
+              <w:br/>
+              <w:t>Method: CNN, Random Forest and other traditional ML models.</w:t>
+            </w:r>
+          </w:p>
+        </w:tc>
+        <w:tc>
+          <w:tcPr>
+            <w:tcW w:type="dxa" w:w="2340"/>
+            <w:vAlign w:val="top"/>
+          </w:tcPr>
+          <w:p>
+            <w:pPr>
+              <w:spacing w:after="0"/>
+            </w:pPr>
+            <w:r/>
+            <w:r>
+              <w:rPr>
+                <w:rFonts w:ascii="Calibri" w:hAnsi="Calibri"/>
+                <w:b w:val="0"/>
+                <w:sz w:val="16"/>
+              </w:rPr>
+              <w:t>48,514 IVF cycles from EMR data.</w:t>
+            </w:r>
+          </w:p>
+        </w:tc>
+        <w:tc>
+          <w:tcPr>
+            <w:tcW w:type="dxa" w:w="2340"/>
+            <w:vAlign w:val="top"/>
+          </w:tcPr>
+          <w:p>
+            <w:pPr>
+              <w:spacing w:after="0"/>
+            </w:pPr>
+            <w:r/>
+            <w:r>
+              <w:rPr>
+                <w:rFonts w:ascii="Calibri" w:hAnsi="Calibri"/>
+                <w:b w:val="0"/>
+                <w:sz w:val="16"/>
+              </w:rPr>
+              <w:t>Retrospective Design; Need External Validation; Need Real-world Deployment Evidence</w:t>
+              <w:br/>
+              <w:t>Relevance: High</w:t>
+            </w:r>
+          </w:p>
+        </w:tc>
+      </w:tr>
+      <w:tr>
+        <w:tc>
+          <w:tcPr>
+            <w:tcW w:type="dxa" w:w="2340"/>
+            <w:vAlign w:val="top"/>
+          </w:tcPr>
+          <w:p>
+            <w:pPr>
+              <w:spacing w:after="0"/>
+            </w:pPr>
+            <w:r/>
+            <w:r>
+              <w:rPr>
+                <w:rFonts w:ascii="Calibri" w:hAnsi="Calibri"/>
+                <w:b w:val="0"/>
+                <w:sz w:val="16"/>
+              </w:rPr>
+              <w:t>Paper 10 (2025)</w:t>
+              <w:br/>
+              <w:t>Optimizing predictive features using machine learning for early miscarriage risk following single vitrified-warmed blastocyst transfer</w:t>
+              <w:br/>
+              <w:t>Frontiers in Endocrinology</w:t>
+            </w:r>
+          </w:p>
+        </w:tc>
+        <w:tc>
+          <w:tcPr>
+            <w:tcW w:type="dxa" w:w="2340"/>
+            <w:vAlign w:val="top"/>
+          </w:tcPr>
+          <w:p>
+            <w:pPr>
+              <w:spacing w:after="0"/>
+            </w:pPr>
+            <w:r/>
+            <w:r>
+              <w:rPr>
+                <w:rFonts w:ascii="Calibri" w:hAnsi="Calibri"/>
+                <w:b w:val="0"/>
+                <w:sz w:val="16"/>
+              </w:rPr>
+              <w:t>Predict early miscarriage risk after single vitrified-warmed blastocyst transfer.</w:t>
+              <w:br/>
+              <w:t>Method: Logistic Regression, Random Forest, Gradient Boosting, Voting Classifier.</w:t>
+            </w:r>
+          </w:p>
+        </w:tc>
+        <w:tc>
+          <w:tcPr>
+            <w:tcW w:type="dxa" w:w="2340"/>
+            <w:vAlign w:val="top"/>
+          </w:tcPr>
+          <w:p>
+            <w:pPr>
+              <w:spacing w:after="0"/>
+            </w:pPr>
+            <w:r/>
+            <w:r>
+              <w:rPr>
+                <w:rFonts w:ascii="Calibri" w:hAnsi="Calibri"/>
+                <w:b w:val="0"/>
+                <w:sz w:val="16"/>
+              </w:rPr>
+              <w:t>Dual-center retrospective analysis of 1,664 SVBT cycles, including 308 early miscarriage cases.</w:t>
+            </w:r>
+          </w:p>
+        </w:tc>
+        <w:tc>
+          <w:tcPr>
+            <w:tcW w:type="dxa" w:w="2340"/>
+            <w:vAlign w:val="top"/>
+          </w:tcPr>
+          <w:p>
+            <w:pPr>
+              <w:spacing w:after="0"/>
+            </w:pPr>
+            <w:r/>
+            <w:r>
+              <w:rPr>
+                <w:rFonts w:ascii="Calibri" w:hAnsi="Calibri"/>
+                <w:b w:val="0"/>
+                <w:sz w:val="16"/>
+              </w:rPr>
+              <w:t>Retrospective Design; Limited Multi-center Validation; Need Clinical Decision Support</w:t>
+              <w:br/>
+              <w:t>Relevance: Medium</w:t>
+            </w:r>
+          </w:p>
+        </w:tc>
+      </w:tr>
+      <w:tr>
+        <w:tc>
+          <w:tcPr>
+            <w:tcW w:type="dxa" w:w="2340"/>
+            <w:vAlign w:val="top"/>
+          </w:tcPr>
+          <w:p>
+            <w:pPr>
+              <w:spacing w:after="0"/>
+            </w:pPr>
+            <w:r/>
+            <w:r>
+              <w:rPr>
+                <w:rFonts w:ascii="Calibri" w:hAnsi="Calibri"/>
+                <w:b w:val="0"/>
+                <w:sz w:val="16"/>
+              </w:rPr>
+              <w:t>Paper 11 (2025)</w:t>
+              <w:br/>
+              <w:t>Machine learning-based prediction of IVF outcomes: the central role of female preprocedural factors</w:t>
+              <w:br/>
+              <w:t>Biomedicines</w:t>
+            </w:r>
+          </w:p>
+        </w:tc>
+        <w:tc>
+          <w:tcPr>
+            <w:tcW w:type="dxa" w:w="2340"/>
+            <w:vAlign w:val="top"/>
+          </w:tcPr>
+          <w:p>
+            <w:pPr>
+              <w:spacing w:after="0"/>
+            </w:pPr>
+            <w:r/>
+            <w:r>
+              <w:rPr>
+                <w:rFonts w:ascii="Calibri" w:hAnsi="Calibri"/>
+                <w:b w:val="0"/>
+                <w:sz w:val="16"/>
+              </w:rPr>
+              <w:t>Develop and validate per-cycle IVF success prediction using preprocedural clinical factors.</w:t>
+              <w:br/>
+              <w:t>Method: XGBoost classifier using 14 baseline predictors and refined 9-variable model.</w:t>
+            </w:r>
+          </w:p>
+        </w:tc>
+        <w:tc>
+          <w:tcPr>
+            <w:tcW w:type="dxa" w:w="2340"/>
+            <w:vAlign w:val="top"/>
+          </w:tcPr>
+          <w:p>
+            <w:pPr>
+              <w:spacing w:after="0"/>
+            </w:pPr>
+            <w:r/>
+            <w:r>
+              <w:rPr>
+                <w:rFonts w:ascii="Calibri" w:hAnsi="Calibri"/>
+                <w:b w:val="0"/>
+                <w:sz w:val="16"/>
+              </w:rPr>
+              <w:t>1,243 IVF/ICSI cycles from University of Szeged plus same-centre external validation cohort of 92 cycles.</w:t>
+            </w:r>
+          </w:p>
+        </w:tc>
+        <w:tc>
+          <w:tcPr>
+            <w:tcW w:type="dxa" w:w="2340"/>
+            <w:vAlign w:val="top"/>
+          </w:tcPr>
+          <w:p>
+            <w:pPr>
+              <w:spacing w:after="0"/>
+            </w:pPr>
+            <w:r/>
+            <w:r>
+              <w:rPr>
+                <w:rFonts w:ascii="Calibri" w:hAnsi="Calibri"/>
+                <w:b w:val="0"/>
+                <w:sz w:val="16"/>
+              </w:rPr>
+              <w:t>Need Multi-centre External Validation; Need Clinical Decision Support; Calibration Gap</w:t>
+              <w:br/>
+              <w:t>Relevance: Medium-High</w:t>
+            </w:r>
+          </w:p>
+        </w:tc>
+      </w:tr>
+      <w:tr>
+        <w:tc>
+          <w:tcPr>
+            <w:tcW w:type="dxa" w:w="2340"/>
+            <w:vAlign w:val="top"/>
+          </w:tcPr>
+          <w:p>
+            <w:pPr>
+              <w:spacing w:after="0"/>
+            </w:pPr>
+            <w:r/>
+            <w:r>
+              <w:rPr>
+                <w:rFonts w:ascii="Calibri" w:hAnsi="Calibri"/>
+                <w:b w:val="0"/>
+                <w:sz w:val="16"/>
+              </w:rPr>
+              <w:t>Paper 12 (2024)</w:t>
+              <w:br/>
+              <w:t>The prospect of artificial intelligence to personalize assisted reproductive technology</w:t>
+              <w:br/>
+              <w:t>npj Digital Medicine</w:t>
+            </w:r>
+          </w:p>
+        </w:tc>
+        <w:tc>
+          <w:tcPr>
+            <w:tcW w:type="dxa" w:w="2340"/>
+            <w:vAlign w:val="top"/>
+          </w:tcPr>
+          <w:p>
+            <w:pPr>
+              <w:spacing w:after="0"/>
+            </w:pPr>
+            <w:r/>
+            <w:r>
+              <w:rPr>
+                <w:rFonts w:ascii="Calibri" w:hAnsi="Calibri"/>
+                <w:b w:val="0"/>
+                <w:sz w:val="16"/>
+              </w:rPr>
+              <w:t>Review current and future AI implementations for personalized ART/IVF.</w:t>
+              <w:br/>
+              <w:t>Method: Narrative review of AI applications, CDSS opportunities and translational barriers.</w:t>
+            </w:r>
+          </w:p>
+        </w:tc>
+        <w:tc>
+          <w:tcPr>
+            <w:tcW w:type="dxa" w:w="2340"/>
+            <w:vAlign w:val="top"/>
+          </w:tcPr>
+          <w:p>
+            <w:pPr>
+              <w:spacing w:after="0"/>
+            </w:pPr>
+            <w:r/>
+            <w:r>
+              <w:rPr>
+                <w:rFonts w:ascii="Calibri" w:hAnsi="Calibri"/>
+                <w:b w:val="0"/>
+                <w:sz w:val="16"/>
+              </w:rPr>
+              <w:t>Review article; no original dataset generated.</w:t>
+            </w:r>
+          </w:p>
+        </w:tc>
+        <w:tc>
+          <w:tcPr>
+            <w:tcW w:type="dxa" w:w="2340"/>
+            <w:vAlign w:val="top"/>
+          </w:tcPr>
+          <w:p>
+            <w:pPr>
+              <w:spacing w:after="0"/>
+            </w:pPr>
+            <w:r/>
+            <w:r>
+              <w:rPr>
+                <w:rFonts w:ascii="Calibri" w:hAnsi="Calibri"/>
+                <w:b w:val="0"/>
+                <w:sz w:val="16"/>
+              </w:rPr>
+              <w:t>Lack of Standardization; Need External Validation; Trustworthy AI Gap; Need Clinical Decision Support</w:t>
+              <w:br/>
+              <w:t>Relevance: Very High for framing</w:t>
+            </w:r>
+          </w:p>
+        </w:tc>
+      </w:tr>
+      <w:tr>
+        <w:tc>
+          <w:tcPr>
+            <w:tcW w:type="dxa" w:w="2340"/>
+            <w:vAlign w:val="top"/>
+          </w:tcPr>
+          <w:p>
+            <w:pPr>
+              <w:spacing w:after="0"/>
+            </w:pPr>
+            <w:r/>
+            <w:r>
+              <w:rPr>
+                <w:rFonts w:ascii="Calibri" w:hAnsi="Calibri"/>
+                <w:b w:val="0"/>
+                <w:sz w:val="16"/>
+              </w:rPr>
+              <w:t>Paper 13 (2025)</w:t>
+              <w:br/>
+              <w:t>Current progress and open challenges for applying artificial intelligence across the in vitro fertilization cycle</w:t>
+              <w:br/>
+              <w:t>Patterns</w:t>
+            </w:r>
+          </w:p>
+        </w:tc>
+        <w:tc>
+          <w:tcPr>
+            <w:tcW w:type="dxa" w:w="2340"/>
+            <w:vAlign w:val="top"/>
+          </w:tcPr>
+          <w:p>
+            <w:pPr>
+              <w:spacing w:after="0"/>
+            </w:pPr>
+            <w:r/>
+            <w:r>
+              <w:rPr>
+                <w:rFonts w:ascii="Calibri" w:hAnsi="Calibri"/>
+                <w:b w:val="0"/>
+                <w:sz w:val="16"/>
+              </w:rPr>
+              <w:t>Summarize AI-IVF applications by data modality and identify open challenges.</w:t>
+              <w:br/>
+              <w:t>Method: Review/synthesis of structured clinical, image, video, omics and multimodal AI-IVF studies.</w:t>
+            </w:r>
+          </w:p>
+        </w:tc>
+        <w:tc>
+          <w:tcPr>
+            <w:tcW w:type="dxa" w:w="2340"/>
+            <w:vAlign w:val="top"/>
+          </w:tcPr>
+          <w:p>
+            <w:pPr>
+              <w:spacing w:after="0"/>
+            </w:pPr>
+            <w:r/>
+            <w:r>
+              <w:rPr>
+                <w:rFonts w:ascii="Calibri" w:hAnsi="Calibri"/>
+                <w:b w:val="0"/>
+                <w:sz w:val="16"/>
+              </w:rPr>
+              <w:t>Review article; no original dataset generated.</w:t>
+            </w:r>
+          </w:p>
+        </w:tc>
+        <w:tc>
+          <w:tcPr>
+            <w:tcW w:type="dxa" w:w="2340"/>
+            <w:vAlign w:val="top"/>
+          </w:tcPr>
+          <w:p>
+            <w:pPr>
+              <w:spacing w:after="0"/>
+            </w:pPr>
+            <w:r/>
+            <w:r>
+              <w:rPr>
+                <w:rFonts w:ascii="Calibri" w:hAnsi="Calibri"/>
+                <w:b w:val="0"/>
+                <w:sz w:val="16"/>
+              </w:rPr>
+              <w:t>Need External Validation; Trustworthy AI Gap; Need Multimodal Data; Need Real-world Deployment Evidence</w:t>
+              <w:br/>
+              <w:t>Relevance: Very High for trend and gap synthesis</w:t>
+            </w:r>
+          </w:p>
+        </w:tc>
+      </w:tr>
+      <w:tr>
+        <w:tc>
+          <w:tcPr>
+            <w:tcW w:type="dxa" w:w="2340"/>
+            <w:vAlign w:val="top"/>
+          </w:tcPr>
+          <w:p>
+            <w:pPr>
+              <w:spacing w:after="0"/>
+            </w:pPr>
+            <w:r/>
+            <w:r>
+              <w:rPr>
+                <w:rFonts w:ascii="Calibri" w:hAnsi="Calibri"/>
+                <w:b w:val="0"/>
+                <w:sz w:val="16"/>
+              </w:rPr>
+              <w:t>Paper 14 (2025)</w:t>
+              <w:br/>
+              <w:t>Patient-centred explainability in IVF outcome prediction</w:t>
+              <w:br/>
+              <w:t>arXiv preprint</w:t>
+            </w:r>
+          </w:p>
+        </w:tc>
+        <w:tc>
+          <w:tcPr>
+            <w:tcW w:type="dxa" w:w="2340"/>
+            <w:vAlign w:val="top"/>
+          </w:tcPr>
+          <w:p>
+            <w:pPr>
+              <w:spacing w:after="0"/>
+            </w:pPr>
+            <w:r/>
+            <w:r>
+              <w:rPr>
+                <w:rFonts w:ascii="Calibri" w:hAnsi="Calibri"/>
+                <w:b w:val="0"/>
+                <w:sz w:val="16"/>
+              </w:rPr>
+              <w:t>Evaluate understandability and trust in an IVF outcome prediction interface from patient feedback, survey and interviews.</w:t>
+              <w:br/>
+              <w:t>Method: Human-centered XAI/interface evaluation.</w:t>
+            </w:r>
+          </w:p>
+        </w:tc>
+        <w:tc>
+          <w:tcPr>
+            <w:tcW w:type="dxa" w:w="2340"/>
+            <w:vAlign w:val="top"/>
+          </w:tcPr>
+          <w:p>
+            <w:pPr>
+              <w:spacing w:after="0"/>
+            </w:pPr>
+            <w:r/>
+            <w:r>
+              <w:rPr>
+                <w:rFonts w:ascii="Calibri" w:hAnsi="Calibri"/>
+                <w:b w:val="0"/>
+                <w:sz w:val="16"/>
+              </w:rPr>
+              <w:t>Four years of anonymous patient feedback plus user survey and interviews.</w:t>
+            </w:r>
+          </w:p>
+        </w:tc>
+        <w:tc>
+          <w:tcPr>
+            <w:tcW w:type="dxa" w:w="2340"/>
+            <w:vAlign w:val="top"/>
+          </w:tcPr>
+          <w:p>
+            <w:pPr>
+              <w:spacing w:after="0"/>
+            </w:pPr>
+            <w:r/>
+            <w:r>
+              <w:rPr>
+                <w:rFonts w:ascii="Calibri" w:hAnsi="Calibri"/>
+                <w:b w:val="0"/>
+                <w:sz w:val="16"/>
+              </w:rPr>
+              <w:t>Patient-centered XAI Gap; Trustworthy AI Gap; Need Personalized Explanation</w:t>
+              <w:br/>
+              <w:t>Relevance: Medium-High</w:t>
+            </w:r>
+          </w:p>
+        </w:tc>
+      </w:tr>
+      <w:tr>
+        <w:tc>
+          <w:tcPr>
+            <w:tcW w:type="dxa" w:w="2340"/>
+            <w:vAlign w:val="top"/>
+          </w:tcPr>
+          <w:p>
+            <w:pPr>
+              <w:spacing w:after="0"/>
+            </w:pPr>
+            <w:r/>
+            <w:r>
+              <w:rPr>
+                <w:rFonts w:ascii="Calibri" w:hAnsi="Calibri"/>
+                <w:b w:val="0"/>
+                <w:sz w:val="16"/>
+              </w:rPr>
+              <w:t>Paper 15 (2026)</w:t>
+              <w:br/>
+              <w:t>AI-based live birth prediction in IVF cycles: a systematic review without meta-analysis of model performance and validation</w:t>
+              <w:br/>
+              <w:t>Middle East Fertility Society Journal</w:t>
+            </w:r>
+          </w:p>
+        </w:tc>
+        <w:tc>
+          <w:tcPr>
+            <w:tcW w:type="dxa" w:w="2340"/>
+            <w:vAlign w:val="top"/>
+          </w:tcPr>
+          <w:p>
+            <w:pPr>
+              <w:spacing w:after="0"/>
+            </w:pPr>
+            <w:r/>
+            <w:r>
+              <w:rPr>
+                <w:rFonts w:ascii="Calibri" w:hAnsi="Calibri"/>
+                <w:b w:val="0"/>
+                <w:sz w:val="16"/>
+              </w:rPr>
+              <w:t>Systematically review AI-based live-birth prediction models in IVF cycles.</w:t>
+              <w:br/>
+              <w:t>Method: Systematic review without meta-analysis.</w:t>
+            </w:r>
+          </w:p>
+        </w:tc>
+        <w:tc>
+          <w:tcPr>
+            <w:tcW w:type="dxa" w:w="2340"/>
+            <w:vAlign w:val="top"/>
+          </w:tcPr>
+          <w:p>
+            <w:pPr>
+              <w:spacing w:after="0"/>
+            </w:pPr>
+            <w:r/>
+            <w:r>
+              <w:rPr>
+                <w:rFonts w:ascii="Calibri" w:hAnsi="Calibri"/>
+                <w:b w:val="0"/>
+                <w:sz w:val="16"/>
+              </w:rPr>
+              <w:t>Systematic review of live-birth prediction studies; included because it directly synthesizes 2021-2025 evidence though published after target window.</w:t>
+            </w:r>
+          </w:p>
+        </w:tc>
+        <w:tc>
+          <w:tcPr>
+            <w:tcW w:type="dxa" w:w="2340"/>
+            <w:vAlign w:val="top"/>
+          </w:tcPr>
+          <w:p>
+            <w:pPr>
+              <w:spacing w:after="0"/>
+            </w:pPr>
+            <w:r/>
+            <w:r>
+              <w:rPr>
+                <w:rFonts w:ascii="Calibri" w:hAnsi="Calibri"/>
+                <w:b w:val="0"/>
+                <w:sz w:val="16"/>
+              </w:rPr>
+              <w:t>Retrospective Design; Selection Bias; Internal Validation Overfitting; Need External Validation</w:t>
+              <w:br/>
+              <w:t>Relevance: High as synthesis, outside year window</w:t>
+            </w:r>
+          </w:p>
+        </w:tc>
+      </w:tr>
+      <w:tr>
+        <w:tc>
+          <w:tcPr>
+            <w:tcW w:type="dxa" w:w="2340"/>
+            <w:vAlign w:val="top"/>
+          </w:tcPr>
+          <w:p>
+            <w:pPr>
+              <w:spacing w:after="0"/>
+            </w:pPr>
+            <w:r/>
+            <w:r>
+              <w:rPr>
+                <w:rFonts w:ascii="Calibri" w:hAnsi="Calibri"/>
+                <w:b w:val="0"/>
+                <w:sz w:val="16"/>
+              </w:rPr>
+              <w:t>Paper 16 (2024)</w:t>
+              <w:br/>
+              <w:t>Comparative study of machine learning approaches integrated with genetic algorithm for IVF success prediction</w:t>
+              <w:br/>
+              <w:t>PLOS ONE</w:t>
+            </w:r>
+          </w:p>
+        </w:tc>
+        <w:tc>
+          <w:tcPr>
+            <w:tcW w:type="dxa" w:w="2340"/>
+            <w:vAlign w:val="top"/>
+          </w:tcPr>
+          <w:p>
+            <w:pPr>
+              <w:spacing w:after="0"/>
+            </w:pPr>
+            <w:r/>
+            <w:r>
+              <w:rPr>
+                <w:rFonts w:ascii="Calibri" w:hAnsi="Calibri"/>
+                <w:b w:val="0"/>
+                <w:sz w:val="16"/>
+              </w:rPr>
+              <w:t>Compare ML algorithms with genetic-algorithm feature selection for IVF success prediction.</w:t>
+              <w:br/>
+              <w:t>Method: ANN, RPART, Random Forest, SVM and AdaBoost with Genetic Algorithm feature selection.</w:t>
+            </w:r>
+          </w:p>
+        </w:tc>
+        <w:tc>
+          <w:tcPr>
+            <w:tcW w:type="dxa" w:w="2340"/>
+            <w:vAlign w:val="top"/>
+          </w:tcPr>
+          <w:p>
+            <w:pPr>
+              <w:spacing w:after="0"/>
+            </w:pPr>
+            <w:r/>
+            <w:r>
+              <w:rPr>
+                <w:rFonts w:ascii="Calibri" w:hAnsi="Calibri"/>
+                <w:b w:val="0"/>
+                <w:sz w:val="16"/>
+              </w:rPr>
+              <w:t>Single medical facility in Tehran, Iran; IVF clinical dataset.</w:t>
+            </w:r>
+          </w:p>
+        </w:tc>
+        <w:tc>
+          <w:tcPr>
+            <w:tcW w:type="dxa" w:w="2340"/>
+            <w:vAlign w:val="top"/>
+          </w:tcPr>
+          <w:p>
+            <w:pPr>
+              <w:spacing w:after="0"/>
+            </w:pPr>
+            <w:r/>
+            <w:r>
+              <w:rPr>
+                <w:rFonts w:ascii="Calibri" w:hAnsi="Calibri"/>
+                <w:b w:val="0"/>
+                <w:sz w:val="16"/>
+              </w:rPr>
+              <w:t>Single-center Study; Need External Validation; Limited Population Diversity; Need Clinical Decision Support</w:t>
+              <w:br/>
+              <w:t>Relevance: High</w:t>
+            </w:r>
+          </w:p>
+        </w:tc>
+      </w:tr>
+      <w:tr>
+        <w:tc>
+          <w:tcPr>
+            <w:tcW w:type="dxa" w:w="2340"/>
+            <w:vAlign w:val="top"/>
+          </w:tcPr>
+          <w:p>
+            <w:pPr>
+              <w:spacing w:after="0"/>
+            </w:pPr>
+            <w:r/>
+            <w:r>
+              <w:rPr>
+                <w:rFonts w:ascii="Calibri" w:hAnsi="Calibri"/>
+                <w:b w:val="0"/>
+                <w:sz w:val="16"/>
+              </w:rPr>
+              <w:t>Paper 17 (2024)</w:t>
+              <w:br/>
+              <w:t>Catalyzing IVF outcome prediction: exploring advanced machine learning paradigms for enhanced success rate prognostication</w:t>
+              <w:br/>
+              <w:t>Frontiers in Artificial Intelligence</w:t>
+            </w:r>
+          </w:p>
+        </w:tc>
+        <w:tc>
+          <w:tcPr>
+            <w:tcW w:type="dxa" w:w="2340"/>
+            <w:vAlign w:val="top"/>
+          </w:tcPr>
+          <w:p>
+            <w:pPr>
+              <w:spacing w:after="0"/>
+            </w:pPr>
+            <w:r/>
+            <w:r>
+              <w:rPr>
+                <w:rFonts w:ascii="Calibri" w:hAnsi="Calibri"/>
+                <w:b w:val="0"/>
+                <w:sz w:val="16"/>
+              </w:rPr>
+              <w:t>Improve IVF success-rate prediction through advanced ML and gynecological expertise.</w:t>
+              <w:br/>
+              <w:t>Method: Logistic Regression, Gaussian NB, SVM, MLP, KNN, Random Forest, AdaBoost, LogitBoost, RUSBoost and RSM.</w:t>
+            </w:r>
+          </w:p>
+        </w:tc>
+        <w:tc>
+          <w:tcPr>
+            <w:tcW w:type="dxa" w:w="2340"/>
+            <w:vAlign w:val="top"/>
+          </w:tcPr>
+          <w:p>
+            <w:pPr>
+              <w:spacing w:after="0"/>
+            </w:pPr>
+            <w:r/>
+            <w:r>
+              <w:rPr>
+                <w:rFonts w:ascii="Calibri" w:hAnsi="Calibri"/>
+                <w:b w:val="0"/>
+                <w:sz w:val="16"/>
+              </w:rPr>
+              <w:t>Datasets from 2017-2018 and 2010-2016.</w:t>
+            </w:r>
+          </w:p>
+        </w:tc>
+        <w:tc>
+          <w:tcPr>
+            <w:tcW w:type="dxa" w:w="2340"/>
+            <w:vAlign w:val="top"/>
+          </w:tcPr>
+          <w:p>
+            <w:pPr>
+              <w:spacing w:after="0"/>
+            </w:pPr>
+            <w:r/>
+            <w:r>
+              <w:rPr>
+                <w:rFonts w:ascii="Calibri" w:hAnsi="Calibri"/>
+                <w:b w:val="0"/>
+                <w:sz w:val="16"/>
+              </w:rPr>
+              <w:t>Retrospective Design; Need Prospective/RCT Validation; Need Clinical Decision Support</w:t>
+              <w:br/>
+              <w:t>Relevance: High</w:t>
+            </w:r>
+          </w:p>
+        </w:tc>
+      </w:tr>
+      <w:tr>
+        <w:tc>
+          <w:tcPr>
+            <w:tcW w:type="dxa" w:w="2340"/>
+            <w:vAlign w:val="top"/>
+          </w:tcPr>
+          <w:p>
+            <w:pPr>
+              <w:spacing w:after="0"/>
+            </w:pPr>
+            <w:r/>
+            <w:r>
+              <w:rPr>
+                <w:rFonts w:ascii="Calibri" w:hAnsi="Calibri"/>
+                <w:b w:val="0"/>
+                <w:sz w:val="16"/>
+              </w:rPr>
+              <w:t>Paper 18 (2022)</w:t>
+              <w:br/>
+              <w:t>Comparison of machine learning classification techniques to predict implantation success in an IVF treatment cycle</w:t>
+              <w:br/>
+              <w:t>Reproductive BioMedicine Online</w:t>
+            </w:r>
+          </w:p>
+        </w:tc>
+        <w:tc>
+          <w:tcPr>
+            <w:tcW w:type="dxa" w:w="2340"/>
+            <w:vAlign w:val="top"/>
+          </w:tcPr>
+          <w:p>
+            <w:pPr>
+              <w:spacing w:after="0"/>
+            </w:pPr>
+            <w:r/>
+            <w:r>
+              <w:rPr>
+                <w:rFonts w:ascii="Calibri" w:hAnsi="Calibri"/>
+                <w:b w:val="0"/>
+                <w:sz w:val="16"/>
+              </w:rPr>
+              <w:t>Compare ML models for predicting implantation success in IVF cycles and variable importance.</w:t>
+              <w:br/>
+              <w:t>Method: Machine learning classification techniques.</w:t>
+            </w:r>
+          </w:p>
+        </w:tc>
+        <w:tc>
+          <w:tcPr>
+            <w:tcW w:type="dxa" w:w="2340"/>
+            <w:vAlign w:val="top"/>
+          </w:tcPr>
+          <w:p>
+            <w:pPr>
+              <w:spacing w:after="0"/>
+            </w:pPr>
+            <w:r/>
+            <w:r>
+              <w:rPr>
+                <w:rFonts w:ascii="Calibri" w:hAnsi="Calibri"/>
+                <w:b w:val="0"/>
+                <w:sz w:val="16"/>
+              </w:rPr>
+              <w:t>IVF treatment-cycle dataset; full dataset details require paper verification.</w:t>
+            </w:r>
+          </w:p>
+        </w:tc>
+        <w:tc>
+          <w:tcPr>
+            <w:tcW w:type="dxa" w:w="2340"/>
+            <w:vAlign w:val="top"/>
+          </w:tcPr>
+          <w:p>
+            <w:pPr>
+              <w:spacing w:after="0"/>
+            </w:pPr>
+            <w:r/>
+            <w:r>
+              <w:rPr>
+                <w:rFonts w:ascii="Calibri" w:hAnsi="Calibri"/>
+                <w:b w:val="0"/>
+                <w:sz w:val="16"/>
+              </w:rPr>
+              <w:t>Need Full-text Verification; Need External Validation</w:t>
+              <w:br/>
+              <w:t>Relevance: Medium</w:t>
+            </w:r>
+          </w:p>
+        </w:tc>
+      </w:tr>
+      <w:tr>
+        <w:tc>
+          <w:tcPr>
+            <w:tcW w:type="dxa" w:w="2340"/>
+            <w:vAlign w:val="top"/>
+          </w:tcPr>
+          <w:p>
+            <w:pPr>
+              <w:spacing w:after="0"/>
+            </w:pPr>
+            <w:r/>
+            <w:r>
+              <w:rPr>
+                <w:rFonts w:ascii="Calibri" w:hAnsi="Calibri"/>
+                <w:b w:val="0"/>
+                <w:sz w:val="16"/>
+              </w:rPr>
+              <w:t>Paper 19 (2022)</w:t>
+              <w:br/>
+              <w:t>Predicting clinical pregnancy using clinical features and machine learning algorithms in in vitro fertilization</w:t>
+              <w:br/>
+              <w:t>PLOS ONE</w:t>
+            </w:r>
+          </w:p>
+        </w:tc>
+        <w:tc>
+          <w:tcPr>
+            <w:tcW w:type="dxa" w:w="2340"/>
+            <w:vAlign w:val="top"/>
+          </w:tcPr>
+          <w:p>
+            <w:pPr>
+              <w:spacing w:after="0"/>
+            </w:pPr>
+            <w:r/>
+            <w:r>
+              <w:rPr>
+                <w:rFonts w:ascii="Calibri" w:hAnsi="Calibri"/>
+                <w:b w:val="0"/>
+                <w:sz w:val="16"/>
+              </w:rPr>
+              <w:t>Construct ML models for clinical pregnancy prediction in IVF using clinical features.</w:t>
+              <w:br/>
+              <w:t>Method: Random Forest and Logistic Regression.</w:t>
+            </w:r>
+          </w:p>
+        </w:tc>
+        <w:tc>
+          <w:tcPr>
+            <w:tcW w:type="dxa" w:w="2340"/>
+            <w:vAlign w:val="top"/>
+          </w:tcPr>
+          <w:p>
+            <w:pPr>
+              <w:spacing w:after="0"/>
+            </w:pPr>
+            <w:r/>
+            <w:r>
+              <w:rPr>
+                <w:rFonts w:ascii="Calibri" w:hAnsi="Calibri"/>
+                <w:b w:val="0"/>
+                <w:sz w:val="16"/>
+              </w:rPr>
+              <w:t>IVF patients from 2007-2019.</w:t>
+            </w:r>
+          </w:p>
+        </w:tc>
+        <w:tc>
+          <w:tcPr>
+            <w:tcW w:type="dxa" w:w="2340"/>
+            <w:vAlign w:val="top"/>
+          </w:tcPr>
+          <w:p>
+            <w:pPr>
+              <w:spacing w:after="0"/>
+            </w:pPr>
+            <w:r/>
+            <w:r>
+              <w:rPr>
+                <w:rFonts w:ascii="Calibri" w:hAnsi="Calibri"/>
+                <w:b w:val="0"/>
+                <w:sz w:val="16"/>
+              </w:rPr>
+              <w:t>Need Full-text Verification; Need External Validation; Need Clinical Decision Support</w:t>
+              <w:br/>
+              <w:t>Relevance: Medium-High</w:t>
+            </w:r>
+          </w:p>
+        </w:tc>
+      </w:tr>
+      <w:tr>
+        <w:tc>
+          <w:tcPr>
+            <w:tcW w:type="dxa" w:w="2340"/>
+            <w:vAlign w:val="top"/>
+          </w:tcPr>
+          <w:p>
+            <w:pPr>
+              <w:spacing w:after="0"/>
+            </w:pPr>
+            <w:r/>
+            <w:r>
+              <w:rPr>
+                <w:rFonts w:ascii="Calibri" w:hAnsi="Calibri"/>
+                <w:b w:val="0"/>
+                <w:sz w:val="16"/>
+              </w:rPr>
+              <w:t>Paper 20 (2022)</w:t>
+              <w:br/>
+              <w:t>Machine Learning Approach to Predict Clinical Pregnancy Potential in Women Undergoing IVF Program</w:t>
+              <w:br/>
+              <w:t>Fertility &amp; Reproduction</w:t>
+            </w:r>
+          </w:p>
+        </w:tc>
+        <w:tc>
+          <w:tcPr>
+            <w:tcW w:type="dxa" w:w="2340"/>
+            <w:vAlign w:val="top"/>
+          </w:tcPr>
+          <w:p>
+            <w:pPr>
+              <w:spacing w:after="0"/>
+            </w:pPr>
+            <w:r/>
+            <w:r>
+              <w:rPr>
+                <w:rFonts w:ascii="Calibri" w:hAnsi="Calibri"/>
+                <w:b w:val="0"/>
+                <w:sz w:val="16"/>
+              </w:rPr>
+              <w:t>Use ML data mining to construct a clinical pregnancy prediction model for IVF.</w:t>
+              <w:br/>
+              <w:t>Method: Decision Tree and Random Forest.</w:t>
+            </w:r>
+          </w:p>
+        </w:tc>
+        <w:tc>
+          <w:tcPr>
+            <w:tcW w:type="dxa" w:w="2340"/>
+            <w:vAlign w:val="top"/>
+          </w:tcPr>
+          <w:p>
+            <w:pPr>
+              <w:spacing w:after="0"/>
+            </w:pPr>
+            <w:r/>
+            <w:r>
+              <w:rPr>
+                <w:rFonts w:ascii="Calibri" w:hAnsi="Calibri"/>
+                <w:b w:val="0"/>
+                <w:sz w:val="16"/>
+              </w:rPr>
+              <w:t>Large practical IVF clinical database; exact size/source require verification.</w:t>
+            </w:r>
+          </w:p>
+        </w:tc>
+        <w:tc>
+          <w:tcPr>
+            <w:tcW w:type="dxa" w:w="2340"/>
+            <w:vAlign w:val="top"/>
+          </w:tcPr>
+          <w:p>
+            <w:pPr>
+              <w:spacing w:after="0"/>
+            </w:pPr>
+            <w:r/>
+            <w:r>
+              <w:rPr>
+                <w:rFonts w:ascii="Calibri" w:hAnsi="Calibri"/>
+                <w:b w:val="0"/>
+                <w:sz w:val="16"/>
+              </w:rPr>
+              <w:t>Lack of Standardization; Need External Validation; Need Clinical Decision Support</w:t>
+              <w:br/>
+              <w:t>Relevance: High for gap argument</w:t>
+            </w:r>
+          </w:p>
+        </w:tc>
+      </w:tr>
+      <w:tr>
+        <w:tc>
+          <w:tcPr>
+            <w:tcW w:type="dxa" w:w="2340"/>
+            <w:vAlign w:val="top"/>
+          </w:tcPr>
+          <w:p>
+            <w:pPr>
+              <w:spacing w:after="0"/>
+            </w:pPr>
+            <w:r/>
+            <w:r>
+              <w:rPr>
+                <w:rFonts w:ascii="Calibri" w:hAnsi="Calibri"/>
+                <w:b w:val="0"/>
+                <w:sz w:val="16"/>
+              </w:rPr>
+              <w:t>Paper 21 (2025)</w:t>
+              <w:br/>
+              <w:t>Artificial intelligence-driven precision treatment of reproductive medicine-related diseases: the optimal protocol choice for IVF-ET</w:t>
+              <w:br/>
+              <w:t>Journal of Advanced Research</w:t>
+            </w:r>
+          </w:p>
+        </w:tc>
+        <w:tc>
+          <w:tcPr>
+            <w:tcW w:type="dxa" w:w="2340"/>
+            <w:vAlign w:val="top"/>
+          </w:tcPr>
+          <w:p>
+            <w:pPr>
+              <w:spacing w:after="0"/>
+            </w:pPr>
+            <w:r/>
+            <w:r>
+              <w:rPr>
+                <w:rFonts w:ascii="Calibri" w:hAnsi="Calibri"/>
+                <w:b w:val="0"/>
+                <w:sz w:val="16"/>
+              </w:rPr>
+              <w:t>Develop an AI system for personalized ovarian stimulation protocol choice in IVF-ET.</w:t>
+              <w:br/>
+              <w:t>Method: Adaptive ensemble/ACA-FI framework using RF, XGBoost and SOIL feature-selection approaches.</w:t>
+            </w:r>
+          </w:p>
+        </w:tc>
+        <w:tc>
+          <w:tcPr>
+            <w:tcW w:type="dxa" w:w="2340"/>
+            <w:vAlign w:val="top"/>
+          </w:tcPr>
+          <w:p>
+            <w:pPr>
+              <w:spacing w:after="0"/>
+            </w:pPr>
+            <w:r/>
+            <w:r>
+              <w:rPr>
+                <w:rFonts w:ascii="Calibri" w:hAnsi="Calibri"/>
+                <w:b w:val="0"/>
+                <w:sz w:val="16"/>
+              </w:rPr>
+              <w:t>17,791 patients undergoing OS and IVF/ICSI at Tongji Hospital, May 2015-May 2019.</w:t>
+            </w:r>
+          </w:p>
+        </w:tc>
+        <w:tc>
+          <w:tcPr>
+            <w:tcW w:type="dxa" w:w="2340"/>
+            <w:vAlign w:val="top"/>
+          </w:tcPr>
+          <w:p>
+            <w:pPr>
+              <w:spacing w:after="0"/>
+            </w:pPr>
+            <w:r/>
+            <w:r>
+              <w:rPr>
+                <w:rFonts w:ascii="Calibri" w:hAnsi="Calibri"/>
+                <w:b w:val="0"/>
+                <w:sz w:val="16"/>
+              </w:rPr>
+              <w:t>Single-center Study; Need External Validation; Need Clinical Decision Support; Personalized Recommendation Gap</w:t>
+              <w:br/>
+              <w:t>Relevance: Very High</w:t>
+            </w:r>
+          </w:p>
+        </w:tc>
+      </w:tr>
+      <w:tr>
+        <w:tc>
+          <w:tcPr>
+            <w:tcW w:type="dxa" w:w="2340"/>
+            <w:vAlign w:val="top"/>
+          </w:tcPr>
+          <w:p>
+            <w:pPr>
+              <w:spacing w:after="0"/>
+            </w:pPr>
+            <w:r/>
+            <w:r>
+              <w:rPr>
+                <w:rFonts w:ascii="Calibri" w:hAnsi="Calibri"/>
+                <w:b w:val="0"/>
+                <w:sz w:val="16"/>
+              </w:rPr>
+              <w:t>Paper 22 (2025)</w:t>
+              <w:br/>
+              <w:t>Real-world use of an artificial intelligence-powered clinical decision support tool for ovarian stimulation</w:t>
+              <w:br/>
+              <w:t>F&amp;S Reports</w:t>
+            </w:r>
+          </w:p>
+        </w:tc>
+        <w:tc>
+          <w:tcPr>
+            <w:tcW w:type="dxa" w:w="2340"/>
+            <w:vAlign w:val="top"/>
+          </w:tcPr>
+          <w:p>
+            <w:pPr>
+              <w:spacing w:after="0"/>
+            </w:pPr>
+            <w:r/>
+            <w:r>
+              <w:rPr>
+                <w:rFonts w:ascii="Calibri" w:hAnsi="Calibri"/>
+                <w:b w:val="0"/>
+                <w:sz w:val="16"/>
+              </w:rPr>
+              <w:t>Evaluate real-world use of Stim Assist CDSS for FSH dosing and trigger timing during ovarian stimulation.</w:t>
+              <w:br/>
+              <w:t>Method: AI-powered CDSS with Starting Dose and Trigger algorithms.</w:t>
+            </w:r>
+          </w:p>
+        </w:tc>
+        <w:tc>
+          <w:tcPr>
+            <w:tcW w:type="dxa" w:w="2340"/>
+            <w:vAlign w:val="top"/>
+          </w:tcPr>
+          <w:p>
+            <w:pPr>
+              <w:spacing w:after="0"/>
+            </w:pPr>
+            <w:r/>
+            <w:r>
+              <w:rPr>
+                <w:rFonts w:ascii="Calibri" w:hAnsi="Calibri"/>
+                <w:b w:val="0"/>
+                <w:sz w:val="16"/>
+              </w:rPr>
+              <w:t>Single IVF clinic real-world deployment cohort; exact size requires full-paper verification.</w:t>
+            </w:r>
+          </w:p>
+        </w:tc>
+        <w:tc>
+          <w:tcPr>
+            <w:tcW w:type="dxa" w:w="2340"/>
+            <w:vAlign w:val="top"/>
+          </w:tcPr>
+          <w:p>
+            <w:pPr>
+              <w:spacing w:after="0"/>
+            </w:pPr>
+            <w:r/>
+            <w:r>
+              <w:rPr>
+                <w:rFonts w:ascii="Calibri" w:hAnsi="Calibri"/>
+                <w:b w:val="0"/>
+                <w:sz w:val="16"/>
+              </w:rPr>
+              <w:t>Single-center Study; Need Prospective/RCT Validation; Need Real-world Deployment Evidence; Need External Validation</w:t>
+              <w:br/>
+              <w:t>Relevance: Very High</w:t>
+            </w:r>
+          </w:p>
+        </w:tc>
+      </w:tr>
+      <w:tr>
+        <w:tc>
+          <w:tcPr>
+            <w:tcW w:type="dxa" w:w="2340"/>
+            <w:vAlign w:val="top"/>
+          </w:tcPr>
+          <w:p>
+            <w:pPr>
+              <w:spacing w:after="0"/>
+            </w:pPr>
+            <w:r/>
+            <w:r>
+              <w:rPr>
+                <w:rFonts w:ascii="Calibri" w:hAnsi="Calibri"/>
+                <w:b w:val="0"/>
+                <w:sz w:val="16"/>
+              </w:rPr>
+              <w:t>Paper 23 (2024)</w:t>
+              <w:br/>
+              <w:t>A new decision-support tool in a multi-center randomized trial for personalized, optimized, and simplified fertility treatment in non-PCOS patients</w:t>
+              <w:br/>
+              <w:t>Reproduction and Fertility</w:t>
+            </w:r>
+          </w:p>
+        </w:tc>
+        <w:tc>
+          <w:tcPr>
+            <w:tcW w:type="dxa" w:w="2340"/>
+            <w:vAlign w:val="top"/>
+          </w:tcPr>
+          <w:p>
+            <w:pPr>
+              <w:spacing w:after="0"/>
+            </w:pPr>
+            <w:r/>
+            <w:r>
+              <w:rPr>
+                <w:rFonts w:ascii="Calibri" w:hAnsi="Calibri"/>
+                <w:b w:val="0"/>
+                <w:sz w:val="16"/>
+              </w:rPr>
+              <w:t>Evaluate Opt-IVF CDSS for personalized gonadotropin dosing and reduced ultrasound monitoring in non-PCOS IVF patients.</w:t>
+              <w:br/>
+              <w:t>Method: Physics-based model and optimal control theory decision-support tool.</w:t>
+            </w:r>
+          </w:p>
+        </w:tc>
+        <w:tc>
+          <w:tcPr>
+            <w:tcW w:type="dxa" w:w="2340"/>
+            <w:vAlign w:val="top"/>
+          </w:tcPr>
+          <w:p>
+            <w:pPr>
+              <w:spacing w:after="0"/>
+            </w:pPr>
+            <w:r/>
+            <w:r>
+              <w:rPr>
+                <w:rFonts w:ascii="Calibri" w:hAnsi="Calibri"/>
+                <w:b w:val="0"/>
+                <w:sz w:val="16"/>
+              </w:rPr>
+              <w:t>Multi-center randomized trial with 115 women aged 25-45; 55 intervention and 60 control.</w:t>
+            </w:r>
+          </w:p>
+        </w:tc>
+        <w:tc>
+          <w:tcPr>
+            <w:tcW w:type="dxa" w:w="2340"/>
+            <w:vAlign w:val="top"/>
+          </w:tcPr>
+          <w:p>
+            <w:pPr>
+              <w:spacing w:after="0"/>
+            </w:pPr>
+            <w:r/>
+            <w:r>
+              <w:rPr>
+                <w:rFonts w:ascii="Calibri" w:hAnsi="Calibri"/>
+                <w:b w:val="0"/>
+                <w:sz w:val="16"/>
+              </w:rPr>
+              <w:t>Small Dataset; Limited Population Scope; Need External Validation; Need Clinical Decision Support</w:t>
+              <w:br/>
+              <w:t>Relevance: High</w:t>
+            </w:r>
+          </w:p>
+        </w:tc>
+      </w:tr>
+      <w:tr>
+        <w:tc>
+          <w:tcPr>
+            <w:tcW w:type="dxa" w:w="2340"/>
+            <w:vAlign w:val="top"/>
+          </w:tcPr>
+          <w:p>
+            <w:pPr>
+              <w:spacing w:after="0"/>
+            </w:pPr>
+            <w:r/>
+            <w:r>
+              <w:rPr>
+                <w:rFonts w:ascii="Calibri" w:hAnsi="Calibri"/>
+                <w:b w:val="0"/>
+                <w:sz w:val="16"/>
+              </w:rPr>
+              <w:t>Paper 24 (2023)</w:t>
+              <w:br/>
+              <w:t>Towards Automation in IVF: Pre-Clinical Validation of a Deep Learning-Based Embryo Grading System during PGT-A Cycles</w:t>
+              <w:br/>
+              <w:t>Journal of Clinical Medicine</w:t>
+            </w:r>
+          </w:p>
+        </w:tc>
+        <w:tc>
+          <w:tcPr>
+            <w:tcW w:type="dxa" w:w="2340"/>
+            <w:vAlign w:val="top"/>
+          </w:tcPr>
+          <w:p>
+            <w:pPr>
+              <w:spacing w:after="0"/>
+            </w:pPr>
+            <w:r/>
+            <w:r>
+              <w:rPr>
+                <w:rFonts w:ascii="Calibri" w:hAnsi="Calibri"/>
+                <w:b w:val="0"/>
+                <w:sz w:val="16"/>
+              </w:rPr>
+              <w:t>Validate a deep-learning embryo grading/ranking system during PGT-A cycles.</w:t>
+              <w:br/>
+              <w:t>Method: iDAScore v1.0 deep learning model using 3D CNN.</w:t>
+            </w:r>
+          </w:p>
+        </w:tc>
+        <w:tc>
+          <w:tcPr>
+            <w:tcW w:type="dxa" w:w="2340"/>
+            <w:vAlign w:val="top"/>
+          </w:tcPr>
+          <w:p>
+            <w:pPr>
+              <w:spacing w:after="0"/>
+            </w:pPr>
+            <w:r/>
+            <w:r>
+              <w:rPr>
+                <w:rFonts w:ascii="Calibri" w:hAnsi="Calibri"/>
+                <w:b w:val="0"/>
+                <w:sz w:val="16"/>
+              </w:rPr>
+              <w:t>Retrospective pre-clinical external validation including 3,604 blastocysts and 808 euploid transfers from 1,232 cycles.</w:t>
+            </w:r>
+          </w:p>
+        </w:tc>
+        <w:tc>
+          <w:tcPr>
+            <w:tcW w:type="dxa" w:w="2340"/>
+            <w:vAlign w:val="top"/>
+          </w:tcPr>
+          <w:p>
+            <w:pPr>
+              <w:spacing w:after="0"/>
+            </w:pPr>
+            <w:r/>
+            <w:r>
+              <w:rPr>
+                <w:rFonts w:ascii="Calibri" w:hAnsi="Calibri"/>
+                <w:b w:val="0"/>
+                <w:sz w:val="16"/>
+              </w:rPr>
+              <w:t>Retrospective Design; Need External Validation; Need Prospective/RCT Validation; Black-box/Explainability Gap</w:t>
+              <w:br/>
+              <w:t>Relevance: High</w:t>
+            </w:r>
+          </w:p>
+        </w:tc>
+      </w:tr>
+      <w:tr>
+        <w:tc>
+          <w:tcPr>
+            <w:tcW w:type="dxa" w:w="2340"/>
+            <w:vAlign w:val="top"/>
+          </w:tcPr>
+          <w:p>
+            <w:pPr>
+              <w:spacing w:after="0"/>
+            </w:pPr>
+            <w:r/>
+            <w:r>
+              <w:rPr>
+                <w:rFonts w:ascii="Calibri" w:hAnsi="Calibri"/>
+                <w:b w:val="0"/>
+                <w:sz w:val="16"/>
+              </w:rPr>
+              <w:t>Paper 25 (2025)</w:t>
+              <w:br/>
+              <w:t>An explainable ultrasound-based machine learning model for predicting reproductive outcomes after frozen embryo transfer</w:t>
+              <w:br/>
+              <w:t>Reproductive BioMedicine Online</w:t>
+            </w:r>
+          </w:p>
+        </w:tc>
+        <w:tc>
+          <w:tcPr>
+            <w:tcW w:type="dxa" w:w="2340"/>
+            <w:vAlign w:val="top"/>
+          </w:tcPr>
+          <w:p>
+            <w:pPr>
+              <w:spacing w:after="0"/>
+            </w:pPr>
+            <w:r/>
+            <w:r>
+              <w:rPr>
+                <w:rFonts w:ascii="Calibri" w:hAnsi="Calibri"/>
+                <w:b w:val="0"/>
+                <w:sz w:val="16"/>
+              </w:rPr>
+              <w:t>Develop an explainable ultrasound radiomics plus clinical model for reproductive outcome prediction after FET.</w:t>
+              <w:br/>
+              <w:t>Method: Radiomics model, clinical logistic regression model, XGBoost fusion model, SHAP explanations.</w:t>
+            </w:r>
+          </w:p>
+        </w:tc>
+        <w:tc>
+          <w:tcPr>
+            <w:tcW w:type="dxa" w:w="2340"/>
+            <w:vAlign w:val="top"/>
+          </w:tcPr>
+          <w:p>
+            <w:pPr>
+              <w:spacing w:after="0"/>
+            </w:pPr>
+            <w:r/>
+            <w:r>
+              <w:rPr>
+                <w:rFonts w:ascii="Calibri" w:hAnsi="Calibri"/>
+                <w:b w:val="0"/>
+                <w:sz w:val="16"/>
+              </w:rPr>
+              <w:t>Prospective study of 787 infertile females undergoing FET; train n=550, test n=237.</w:t>
+            </w:r>
+          </w:p>
+        </w:tc>
+        <w:tc>
+          <w:tcPr>
+            <w:tcW w:type="dxa" w:w="2340"/>
+            <w:vAlign w:val="top"/>
+          </w:tcPr>
+          <w:p>
+            <w:pPr>
+              <w:spacing w:after="0"/>
+            </w:pPr>
+            <w:r/>
+            <w:r>
+              <w:rPr>
+                <w:rFonts w:ascii="Calibri" w:hAnsi="Calibri"/>
+                <w:b w:val="0"/>
+                <w:sz w:val="16"/>
+              </w:rPr>
+              <w:t>Single-center Study; Need External Validation; Need Multimodal Data; Manual/Subjective Workflow Bias</w:t>
+              <w:br/>
+              <w:t>Relevance: Very High</w:t>
+            </w:r>
+          </w:p>
+        </w:tc>
+      </w:tr>
+      <w:tr>
+        <w:tc>
+          <w:tcPr>
+            <w:tcW w:type="dxa" w:w="2340"/>
+            <w:vAlign w:val="top"/>
+          </w:tcPr>
+          <w:p>
+            <w:pPr>
+              <w:spacing w:after="0"/>
+            </w:pPr>
+            <w:r/>
+            <w:r>
+              <w:rPr>
+                <w:rFonts w:ascii="Calibri" w:hAnsi="Calibri"/>
+                <w:b w:val="0"/>
+                <w:sz w:val="16"/>
+              </w:rPr>
+              <w:t>Paper 26 (2021)</w:t>
+              <w:br/>
+              <w:t>Interpretable, not black-box, artificial intelligence should be used for embryo selection</w:t>
+              <w:br/>
+              <w:t>Human Reproduction Open</w:t>
+            </w:r>
+          </w:p>
+        </w:tc>
+        <w:tc>
+          <w:tcPr>
+            <w:tcW w:type="dxa" w:w="2340"/>
+            <w:vAlign w:val="top"/>
+          </w:tcPr>
+          <w:p>
+            <w:pPr>
+              <w:spacing w:after="0"/>
+            </w:pPr>
+            <w:r/>
+            <w:r>
+              <w:rPr>
+                <w:rFonts w:ascii="Calibri" w:hAnsi="Calibri"/>
+                <w:b w:val="0"/>
+                <w:sz w:val="16"/>
+              </w:rPr>
+              <w:t>Argue for interpretable AI and rigorous evaluation before embryo-selection AI is ethically implemented.</w:t>
+              <w:br/>
+              <w:t>Method: Ethical and methodological critique.</w:t>
+            </w:r>
+          </w:p>
+        </w:tc>
+        <w:tc>
+          <w:tcPr>
+            <w:tcW w:type="dxa" w:w="2340"/>
+            <w:vAlign w:val="top"/>
+          </w:tcPr>
+          <w:p>
+            <w:pPr>
+              <w:spacing w:after="0"/>
+            </w:pPr>
+            <w:r/>
+            <w:r>
+              <w:rPr>
+                <w:rFonts w:ascii="Calibri" w:hAnsi="Calibri"/>
+                <w:b w:val="0"/>
+                <w:sz w:val="16"/>
+              </w:rPr>
+              <w:t>Commentary/review of embryo-selection AI literature.</w:t>
+            </w:r>
+          </w:p>
+        </w:tc>
+        <w:tc>
+          <w:tcPr>
+            <w:tcW w:type="dxa" w:w="2340"/>
+            <w:vAlign w:val="top"/>
+          </w:tcPr>
+          <w:p>
+            <w:pPr>
+              <w:spacing w:after="0"/>
+            </w:pPr>
+            <w:r/>
+            <w:r>
+              <w:rPr>
+                <w:rFonts w:ascii="Calibri" w:hAnsi="Calibri"/>
+                <w:b w:val="0"/>
+                <w:sz w:val="16"/>
+              </w:rPr>
+              <w:t>Black-box/Explainability Gap; Trustworthy AI Gap; Need Prospective/RCT Validation; Patient-centered XAI Gap</w:t>
+              <w:br/>
+              <w:t>Relevance: Very High for conceptual framing</w:t>
+            </w:r>
+          </w:p>
+        </w:tc>
+      </w:tr>
+      <w:tr>
+        <w:tc>
+          <w:tcPr>
+            <w:tcW w:type="dxa" w:w="2340"/>
+            <w:vAlign w:val="top"/>
+          </w:tcPr>
+          <w:p>
+            <w:pPr>
+              <w:spacing w:after="0"/>
+            </w:pPr>
+            <w:r/>
+            <w:r>
+              <w:rPr>
+                <w:rFonts w:ascii="Calibri" w:hAnsi="Calibri"/>
+                <w:b w:val="0"/>
+                <w:sz w:val="16"/>
+              </w:rPr>
+              <w:t>Paper 27 (2024)</w:t>
+              <w:br/>
+              <w:t>Beyond black-box models: explainable AI for embryo ploidy prediction and patient-centric consultation</w:t>
+              <w:br/>
+              <w:t>Journal of Assisted Reproduction and Genetics</w:t>
+            </w:r>
+          </w:p>
+        </w:tc>
+        <w:tc>
+          <w:tcPr>
+            <w:tcW w:type="dxa" w:w="2340"/>
+            <w:vAlign w:val="top"/>
+          </w:tcPr>
+          <w:p>
+            <w:pPr>
+              <w:spacing w:after="0"/>
+            </w:pPr>
+            <w:r/>
+            <w:r>
+              <w:rPr>
+                <w:rFonts w:ascii="Calibri" w:hAnsi="Calibri"/>
+                <w:b w:val="0"/>
+                <w:sz w:val="16"/>
+              </w:rPr>
+              <w:t>Use XAI to improve accuracy and transparency for embryo ploidy prediction using embryonic and clinical data.</w:t>
+              <w:br/>
+              <w:t>Method: RF, LDA, LR, SVM, AdaBoost and LightGBM with SHAP and LIME.</w:t>
+            </w:r>
+          </w:p>
+        </w:tc>
+        <w:tc>
+          <w:tcPr>
+            <w:tcW w:type="dxa" w:w="2340"/>
+            <w:vAlign w:val="top"/>
+          </w:tcPr>
+          <w:p>
+            <w:pPr>
+              <w:spacing w:after="0"/>
+            </w:pPr>
+            <w:r/>
+            <w:r>
+              <w:rPr>
+                <w:rFonts w:ascii="Calibri" w:hAnsi="Calibri"/>
+                <w:b w:val="0"/>
+                <w:sz w:val="16"/>
+              </w:rPr>
+              <w:t>1,908 blastocyst embryos with ploidy status, morphokinetic features, morphology grades and 11 clinical variables.</w:t>
+            </w:r>
+          </w:p>
+        </w:tc>
+        <w:tc>
+          <w:tcPr>
+            <w:tcW w:type="dxa" w:w="2340"/>
+            <w:vAlign w:val="top"/>
+          </w:tcPr>
+          <w:p>
+            <w:pPr>
+              <w:spacing w:after="0"/>
+            </w:pPr>
+            <w:r/>
+            <w:r>
+              <w:rPr>
+                <w:rFonts w:ascii="Calibri" w:hAnsi="Calibri"/>
+                <w:b w:val="0"/>
+                <w:sz w:val="16"/>
+              </w:rPr>
+              <w:t>Black-box/Explainability Gap; Patient-centered XAI Gap; Need External Validation</w:t>
+              <w:br/>
+              <w:t>Relevance: High</w:t>
+            </w:r>
+          </w:p>
+        </w:tc>
+      </w:tr>
+      <w:tr>
+        <w:tc>
+          <w:tcPr>
+            <w:tcW w:type="dxa" w:w="2340"/>
+            <w:vAlign w:val="top"/>
+          </w:tcPr>
+          <w:p>
+            <w:pPr>
+              <w:spacing w:after="0"/>
+            </w:pPr>
+            <w:r/>
+            <w:r>
+              <w:rPr>
+                <w:rFonts w:ascii="Calibri" w:hAnsi="Calibri"/>
+                <w:b w:val="0"/>
+                <w:sz w:val="16"/>
+              </w:rPr>
+              <w:t>Paper 28 (2024)</w:t>
+              <w:br/>
+              <w:t>Deep learning versus manual morphology-based embryo selection in IVF: a randomized, double-blind noninferiority trial</w:t>
+              <w:br/>
+              <w:t>Nature Medicine</w:t>
+            </w:r>
+          </w:p>
+        </w:tc>
+        <w:tc>
+          <w:tcPr>
+            <w:tcW w:type="dxa" w:w="2340"/>
+            <w:vAlign w:val="top"/>
+          </w:tcPr>
+          <w:p>
+            <w:pPr>
+              <w:spacing w:after="0"/>
+            </w:pPr>
+            <w:r/>
+            <w:r>
+              <w:rPr>
+                <w:rFonts w:ascii="Calibri" w:hAnsi="Calibri"/>
+                <w:b w:val="0"/>
+                <w:sz w:val="16"/>
+              </w:rPr>
+              <w:t>Assess whether deep learning embryo selection is noninferior to standard morphology-based embryo selection.</w:t>
+              <w:br/>
+              <w:t>Method: Deep learning embryo selection using iDAScore compared with embryologist morphology-based selection.</w:t>
+            </w:r>
+          </w:p>
+        </w:tc>
+        <w:tc>
+          <w:tcPr>
+            <w:tcW w:type="dxa" w:w="2340"/>
+            <w:vAlign w:val="top"/>
+          </w:tcPr>
+          <w:p>
+            <w:pPr>
+              <w:spacing w:after="0"/>
+            </w:pPr>
+            <w:r/>
+            <w:r>
+              <w:rPr>
+                <w:rFonts w:ascii="Calibri" w:hAnsi="Calibri"/>
+                <w:b w:val="0"/>
+                <w:sz w:val="16"/>
+              </w:rPr>
+              <w:t>Multicenter randomized double-blind noninferiority trial across 14 IVF clinics in Australia and Europe; 1,066 patients, 533 per arm.</w:t>
+            </w:r>
+          </w:p>
+        </w:tc>
+        <w:tc>
+          <w:tcPr>
+            <w:tcW w:type="dxa" w:w="2340"/>
+            <w:vAlign w:val="top"/>
+          </w:tcPr>
+          <w:p>
+            <w:pPr>
+              <w:spacing w:after="0"/>
+            </w:pPr>
+            <w:r/>
+            <w:r>
+              <w:rPr>
+                <w:rFonts w:ascii="Calibri" w:hAnsi="Calibri"/>
+                <w:b w:val="0"/>
+                <w:sz w:val="16"/>
+              </w:rPr>
+              <w:t>Need Prospective/RCT Validation; Need Real-world Deployment Evidence; Trustworthy AI Gap; Clinical Utility Gap</w:t>
+              <w:br/>
+              <w:t>Relevance: Very High</w:t>
+            </w:r>
+          </w:p>
+        </w:tc>
+      </w:tr>
+      <w:tr>
+        <w:tc>
+          <w:tcPr>
+            <w:tcW w:type="dxa" w:w="2340"/>
+            <w:vAlign w:val="top"/>
+          </w:tcPr>
+          <w:p>
+            <w:pPr>
+              <w:spacing w:after="0"/>
+            </w:pPr>
+            <w:r/>
+            <w:r>
+              <w:rPr>
+                <w:rFonts w:ascii="Calibri" w:hAnsi="Calibri"/>
+                <w:b w:val="0"/>
+                <w:sz w:val="16"/>
+              </w:rPr>
+              <w:t>Paper 29 (2025)</w:t>
+              <w:br/>
+              <w:t>Artificial intelligence-enhanced in-vitro fertilization outcome prediction for the Indian subpopulation: integrating pre-treatment parameters and Bayesian-optimized ensemble techniques</w:t>
+              <w:br/>
+              <w:t>International Journal of Community Medicine and Public Health</w:t>
+            </w:r>
+          </w:p>
+        </w:tc>
+        <w:tc>
+          <w:tcPr>
+            <w:tcW w:type="dxa" w:w="2340"/>
+            <w:vAlign w:val="top"/>
+          </w:tcPr>
+          <w:p>
+            <w:pPr>
+              <w:spacing w:after="0"/>
+            </w:pPr>
+            <w:r/>
+            <w:r>
+              <w:rPr>
+                <w:rFonts w:ascii="Calibri" w:hAnsi="Calibri"/>
+                <w:b w:val="0"/>
+                <w:sz w:val="16"/>
+              </w:rPr>
+              <w:t>Develop and evaluate an ML model for estimating cumulative live-birth probability in the first complete IVF cycle among Indian subpopulations.</w:t>
+              <w:br/>
+              <w:t>Method: Bayesian-optimized ensemble model, reported as BoVe.</w:t>
+            </w:r>
+          </w:p>
+        </w:tc>
+        <w:tc>
+          <w:tcPr>
+            <w:tcW w:type="dxa" w:w="2340"/>
+            <w:vAlign w:val="top"/>
+          </w:tcPr>
+          <w:p>
+            <w:pPr>
+              <w:spacing w:after="0"/>
+            </w:pPr>
+            <w:r/>
+            <w:r>
+              <w:rPr>
+                <w:rFonts w:ascii="Calibri" w:hAnsi="Calibri"/>
+                <w:b w:val="0"/>
+                <w:sz w:val="16"/>
+              </w:rPr>
+              <w:t>Retrospective cohort using IVF-ICSI data from Sir Ganga Ram Hospital, Delhi, India, from 1 January 2018 to 31 October 2022; original dataset 2,908 records and 79 variables.</w:t>
+            </w:r>
+          </w:p>
+        </w:tc>
+        <w:tc>
+          <w:tcPr>
+            <w:tcW w:type="dxa" w:w="2340"/>
+            <w:vAlign w:val="top"/>
+          </w:tcPr>
+          <w:p>
+            <w:pPr>
+              <w:spacing w:after="0"/>
+            </w:pPr>
+            <w:r/>
+            <w:r>
+              <w:rPr>
+                <w:rFonts w:ascii="Calibri" w:hAnsi="Calibri"/>
+                <w:b w:val="0"/>
+                <w:sz w:val="16"/>
+              </w:rPr>
+              <w:t>Indian Population Partially Addressed; Single-center Study; Need External Validation; Retrospective Design; Need Clinical Decision Support</w:t>
+              <w:br/>
+              <w:t>Relevance: High for Indian validation angle</w:t>
+            </w:r>
+          </w:p>
+        </w:tc>
+      </w:tr>
+      <w:tr>
+        <w:tc>
+          <w:tcPr>
+            <w:tcW w:type="dxa" w:w="2340"/>
+            <w:vAlign w:val="top"/>
+          </w:tcPr>
+          <w:p>
+            <w:pPr>
+              <w:spacing w:after="0"/>
+            </w:pPr>
+            <w:r/>
+            <w:r>
+              <w:rPr>
+                <w:rFonts w:ascii="Calibri" w:hAnsi="Calibri"/>
+                <w:b w:val="0"/>
+                <w:sz w:val="16"/>
+              </w:rPr>
+              <w:t>Paper 30 (2024)</w:t>
+              <w:br/>
+              <w:t>Machine learning algorithms in constructing prediction models for assisted reproductive technology related live birth outcomes</w:t>
+              <w:br/>
+              <w:t>Scientific Reports</w:t>
+            </w:r>
+          </w:p>
+        </w:tc>
+        <w:tc>
+          <w:tcPr>
+            <w:tcW w:type="dxa" w:w="2340"/>
+            <w:vAlign w:val="top"/>
+          </w:tcPr>
+          <w:p>
+            <w:pPr>
+              <w:spacing w:after="0"/>
+            </w:pPr>
+            <w:r/>
+            <w:r>
+              <w:rPr>
+                <w:rFonts w:ascii="Calibri" w:hAnsi="Calibri"/>
+                <w:b w:val="0"/>
+                <w:sz w:val="16"/>
+              </w:rPr>
+              <w:t>Construct and internally validate ART-related live-birth prediction models using easily obtainable demographic and clinical indicators.</w:t>
+              <w:br/>
+              <w:t>Method: Logistic Regression, Random Forest, XGBoost and LightGBM with tenfold cross-validation and bootstrap validation.</w:t>
+            </w:r>
+          </w:p>
+        </w:tc>
+        <w:tc>
+          <w:tcPr>
+            <w:tcW w:type="dxa" w:w="2340"/>
+            <w:vAlign w:val="top"/>
+          </w:tcPr>
+          <w:p>
+            <w:pPr>
+              <w:spacing w:after="0"/>
+            </w:pPr>
+            <w:r/>
+            <w:r>
+              <w:rPr>
+                <w:rFonts w:ascii="Calibri" w:hAnsi="Calibri"/>
+                <w:b w:val="0"/>
+                <w:sz w:val="16"/>
+              </w:rPr>
+              <w:t>Retrospective single-institution dataset from Yunnan Province, China; 11,486 couples with complete information from 2015-2022; 3,097 live births.</w:t>
+            </w:r>
+          </w:p>
+        </w:tc>
+        <w:tc>
+          <w:tcPr>
+            <w:tcW w:type="dxa" w:w="2340"/>
+            <w:vAlign w:val="top"/>
+          </w:tcPr>
+          <w:p>
+            <w:pPr>
+              <w:spacing w:after="0"/>
+            </w:pPr>
+            <w:r/>
+            <w:r>
+              <w:rPr>
+                <w:rFonts w:ascii="Calibri" w:hAnsi="Calibri"/>
+                <w:b w:val="0"/>
+                <w:sz w:val="16"/>
+              </w:rPr>
+              <w:t>Single-center Study; Need External Validation; Retrospective Design; Missing AMH; Missing Embryo Quality; Need Clinical Decision Support</w:t>
+              <w:br/>
+              <w:t>Relevance: High</w:t>
+            </w:r>
+          </w:p>
+        </w:tc>
+      </w:tr>
+      <w:tr>
+        <w:tc>
+          <w:tcPr>
+            <w:tcW w:type="dxa" w:w="2340"/>
+            <w:vAlign w:val="top"/>
+          </w:tcPr>
+          <w:p>
+            <w:pPr>
+              <w:spacing w:after="0"/>
+            </w:pPr>
+            <w:r/>
+            <w:r>
+              <w:rPr>
+                <w:rFonts w:ascii="Calibri" w:hAnsi="Calibri"/>
+                <w:b w:val="0"/>
+                <w:sz w:val="16"/>
+              </w:rPr>
+              <w:t>Paper 31 (2025)</w:t>
+              <w:br/>
+              <w:t>Machine learning prediction of clinical pregnancy in endometriosis patients following fresh IVF/ICSI-ET</w:t>
+              <w:br/>
+              <w:t>European Journal of Medical Research</w:t>
+            </w:r>
+          </w:p>
+        </w:tc>
+        <w:tc>
+          <w:tcPr>
+            <w:tcW w:type="dxa" w:w="2340"/>
+            <w:vAlign w:val="top"/>
+          </w:tcPr>
+          <w:p>
+            <w:pPr>
+              <w:spacing w:after="0"/>
+            </w:pPr>
+            <w:r/>
+            <w:r>
+              <w:rPr>
+                <w:rFonts w:ascii="Calibri" w:hAnsi="Calibri"/>
+                <w:b w:val="0"/>
+                <w:sz w:val="16"/>
+              </w:rPr>
+              <w:t>Develop an interpretable ML model for clinical pregnancy in endometriosis patients undergoing fresh IVF/ICSI embryo transfer.</w:t>
+              <w:br/>
+              <w:t>Method: Naive Bayes, Logistic Regression, Random Forest, KNN, Neural Network and XGBoost with feature selection, tenfold cross-validation and SHAP.</w:t>
+            </w:r>
+          </w:p>
+        </w:tc>
+        <w:tc>
+          <w:tcPr>
+            <w:tcW w:type="dxa" w:w="2340"/>
+            <w:vAlign w:val="top"/>
+          </w:tcPr>
+          <w:p>
+            <w:pPr>
+              <w:spacing w:after="0"/>
+            </w:pPr>
+            <w:r/>
+            <w:r>
+              <w:rPr>
+                <w:rFonts w:ascii="Calibri" w:hAnsi="Calibri"/>
+                <w:b w:val="0"/>
+                <w:sz w:val="16"/>
+              </w:rPr>
+              <w:t>Retrospective single-center dataset from Jiangxi Maternal and Child Health Hospital, China; 1,752 endometriosis patients undergoing fresh IVF/ICSI-ET from 2014-2024; 24 clinical and embryology features.</w:t>
+            </w:r>
+          </w:p>
+        </w:tc>
+        <w:tc>
+          <w:tcPr>
+            <w:tcW w:type="dxa" w:w="2340"/>
+            <w:vAlign w:val="top"/>
+          </w:tcPr>
+          <w:p>
+            <w:pPr>
+              <w:spacing w:after="0"/>
+            </w:pPr>
+            <w:r/>
+            <w:r>
+              <w:rPr>
+                <w:rFonts w:ascii="Calibri" w:hAnsi="Calibri"/>
+                <w:b w:val="0"/>
+                <w:sz w:val="16"/>
+              </w:rPr>
+              <w:t>Disease-specific Generalization Gap; Single-center Study; Retrospective Design; Need External Validation; Clinical Pregnancy Not Live Birth; Need Clinical Decision Support</w:t>
+              <w:br/>
+              <w:t>Relevance: High for personalization/subgroup theme</w:t>
+            </w:r>
+          </w:p>
+        </w:tc>
+      </w:tr>
+      <w:tr>
+        <w:tc>
+          <w:tcPr>
+            <w:tcW w:type="dxa" w:w="2340"/>
+            <w:vAlign w:val="top"/>
+          </w:tcPr>
+          <w:p>
+            <w:pPr>
+              <w:spacing w:after="0"/>
+            </w:pPr>
+            <w:r/>
+            <w:r>
+              <w:rPr>
+                <w:rFonts w:ascii="Calibri" w:hAnsi="Calibri"/>
+                <w:b w:val="0"/>
+                <w:sz w:val="16"/>
+              </w:rPr>
+              <w:t>Paper 32 (2025)</w:t>
+              <w:br/>
+              <w:t>Artificial intelligence in assisted reproductive technology: separating the dream from reality</w:t>
+              <w:br/>
+              <w:t>Reproductive BioMedicine Online</w:t>
+            </w:r>
+          </w:p>
+        </w:tc>
+        <w:tc>
+          <w:tcPr>
+            <w:tcW w:type="dxa" w:w="2340"/>
+            <w:vAlign w:val="top"/>
+          </w:tcPr>
+          <w:p>
+            <w:pPr>
+              <w:spacing w:after="0"/>
+            </w:pPr>
+            <w:r/>
+            <w:r>
+              <w:rPr>
+                <w:rFonts w:ascii="Calibri" w:hAnsi="Calibri"/>
+                <w:b w:val="0"/>
+                <w:sz w:val="16"/>
+              </w:rPr>
+              <w:t>Critically review the evidence for AI in ART and separate realistic clinical value from overclaiming.</w:t>
+              <w:br/>
+              <w:t>Method: Critical narrative review.</w:t>
+            </w:r>
+          </w:p>
+        </w:tc>
+        <w:tc>
+          <w:tcPr>
+            <w:tcW w:type="dxa" w:w="2340"/>
+            <w:vAlign w:val="top"/>
+          </w:tcPr>
+          <w:p>
+            <w:pPr>
+              <w:spacing w:after="0"/>
+            </w:pPr>
+            <w:r/>
+            <w:r>
+              <w:rPr>
+                <w:rFonts w:ascii="Calibri" w:hAnsi="Calibri"/>
+                <w:b w:val="0"/>
+                <w:sz w:val="16"/>
+              </w:rPr>
+              <w:t>Critical review of AI applications in ART/IVF.</w:t>
+            </w:r>
+          </w:p>
+        </w:tc>
+        <w:tc>
+          <w:tcPr>
+            <w:tcW w:type="dxa" w:w="2340"/>
+            <w:vAlign w:val="top"/>
+          </w:tcPr>
+          <w:p>
+            <w:pPr>
+              <w:spacing w:after="0"/>
+            </w:pPr>
+            <w:r/>
+            <w:r>
+              <w:rPr>
+                <w:rFonts w:ascii="Calibri" w:hAnsi="Calibri"/>
+                <w:b w:val="0"/>
+                <w:sz w:val="16"/>
+              </w:rPr>
+              <w:t>Need External Validation; Clinical Utility Gap; Trustworthy AI Gap; Need Real-world Deployment Evidence</w:t>
+              <w:br/>
+              <w:t>Relevance: High for thesis justification</w:t>
+            </w:r>
+          </w:p>
+        </w:tc>
+      </w:tr>
+      <w:tr>
+        <w:tc>
+          <w:tcPr>
+            <w:tcW w:type="dxa" w:w="2340"/>
+            <w:vAlign w:val="top"/>
+          </w:tcPr>
+          <w:p>
+            <w:pPr>
+              <w:spacing w:after="0"/>
+            </w:pPr>
+            <w:r/>
+            <w:r>
+              <w:rPr>
+                <w:rFonts w:ascii="Calibri" w:hAnsi="Calibri"/>
+                <w:b w:val="0"/>
+                <w:sz w:val="16"/>
+              </w:rPr>
+              <w:t>Paper 33 (2025)</w:t>
+              <w:br/>
+              <w:t>Development of an explainable machine learning model to predict live birth versus miscarriage among IVF-ET pregnancies</w:t>
+              <w:br/>
+              <w:t>Journal of Medical Artificial Intelligence</w:t>
+            </w:r>
+          </w:p>
+        </w:tc>
+        <w:tc>
+          <w:tcPr>
+            <w:tcW w:type="dxa" w:w="2340"/>
+            <w:vAlign w:val="top"/>
+          </w:tcPr>
+          <w:p>
+            <w:pPr>
+              <w:spacing w:after="0"/>
+            </w:pPr>
+            <w:r/>
+            <w:r>
+              <w:rPr>
+                <w:rFonts w:ascii="Calibri" w:hAnsi="Calibri"/>
+                <w:b w:val="0"/>
+                <w:sz w:val="16"/>
+              </w:rPr>
+              <w:t>Develop an interpretable ML model for live birth versus miscarriage prediction among patients with confirmed pregnancy after IVF-ET.</w:t>
+              <w:br/>
+              <w:t>Method: XGBoost, LightGBM, Logistic Regression and soft-voting ensemble with SHAP explanations.</w:t>
+            </w:r>
+          </w:p>
+        </w:tc>
+        <w:tc>
+          <w:tcPr>
+            <w:tcW w:type="dxa" w:w="2340"/>
+            <w:vAlign w:val="top"/>
+          </w:tcPr>
+          <w:p>
+            <w:pPr>
+              <w:spacing w:after="0"/>
+            </w:pPr>
+            <w:r/>
+            <w:r>
+              <w:rPr>
+                <w:rFonts w:ascii="Calibri" w:hAnsi="Calibri"/>
+                <w:b w:val="0"/>
+                <w:sz w:val="16"/>
+              </w:rPr>
+              <w:t>Public Yuan et al. dataset from Qingdao Women's and Children's Hospital, China; 1,017 singleton IVF-ET pregnancies with confirmed intrauterine pregnancy; 52-55 clinical, hormonal, immune, coagulation and treatment-related variables.</w:t>
+            </w:r>
+          </w:p>
+        </w:tc>
+        <w:tc>
+          <w:tcPr>
+            <w:tcW w:type="dxa" w:w="2340"/>
+            <w:vAlign w:val="top"/>
+          </w:tcPr>
+          <w:p>
+            <w:pPr>
+              <w:spacing w:after="0"/>
+            </w:pPr>
+            <w:r/>
+            <w:r>
+              <w:rPr>
+                <w:rFonts w:ascii="Calibri" w:hAnsi="Calibri"/>
+                <w:b w:val="0"/>
+                <w:sz w:val="16"/>
+              </w:rPr>
+              <w:t>Need External Validation; Single-center Study; Retrospective Design; Need Clinical Decision Support; Trustworthy AI Gap; Real-world Deployment Gap</w:t>
+              <w:br/>
+              <w:t>Relevance: High</w:t>
+            </w:r>
+          </w:p>
+        </w:tc>
+      </w:tr>
+      <w:tr>
+        <w:tc>
+          <w:tcPr>
+            <w:tcW w:type="dxa" w:w="2340"/>
+            <w:vAlign w:val="top"/>
+          </w:tcPr>
+          <w:p>
+            <w:pPr>
+              <w:spacing w:after="0"/>
+            </w:pPr>
+            <w:r/>
+            <w:r>
+              <w:rPr>
+                <w:rFonts w:ascii="Calibri" w:hAnsi="Calibri"/>
+                <w:b w:val="0"/>
+                <w:sz w:val="16"/>
+              </w:rPr>
+              <w:t>Paper 34 (2025)</w:t>
+              <w:br/>
+              <w:t>A review of artificial intelligence applications in in vitro fertilization</w:t>
+              <w:br/>
+              <w:t>Journal of Assisted Reproduction and Genetics</w:t>
+            </w:r>
+          </w:p>
+        </w:tc>
+        <w:tc>
+          <w:tcPr>
+            <w:tcW w:type="dxa" w:w="2340"/>
+            <w:vAlign w:val="top"/>
+          </w:tcPr>
+          <w:p>
+            <w:pPr>
+              <w:spacing w:after="0"/>
+            </w:pPr>
+            <w:r/>
+            <w:r>
+              <w:rPr>
+                <w:rFonts w:ascii="Calibri" w:hAnsi="Calibri"/>
+                <w:b w:val="0"/>
+                <w:sz w:val="16"/>
+              </w:rPr>
+              <w:t>Review recent AI applications across IVF, including embryo, gamete and clinical decision areas.</w:t>
+              <w:br/>
+              <w:t>Method: Narrative review.</w:t>
+            </w:r>
+          </w:p>
+        </w:tc>
+        <w:tc>
+          <w:tcPr>
+            <w:tcW w:type="dxa" w:w="2340"/>
+            <w:vAlign w:val="top"/>
+          </w:tcPr>
+          <w:p>
+            <w:pPr>
+              <w:spacing w:after="0"/>
+            </w:pPr>
+            <w:r/>
+            <w:r>
+              <w:rPr>
+                <w:rFonts w:ascii="Calibri" w:hAnsi="Calibri"/>
+                <w:b w:val="0"/>
+                <w:sz w:val="16"/>
+              </w:rPr>
+              <w:t>Review paper.</w:t>
+            </w:r>
+          </w:p>
+        </w:tc>
+        <w:tc>
+          <w:tcPr>
+            <w:tcW w:type="dxa" w:w="2340"/>
+            <w:vAlign w:val="top"/>
+          </w:tcPr>
+          <w:p>
+            <w:pPr>
+              <w:spacing w:after="0"/>
+            </w:pPr>
+            <w:r/>
+            <w:r>
+              <w:rPr>
+                <w:rFonts w:ascii="Calibri" w:hAnsi="Calibri"/>
+                <w:b w:val="0"/>
+                <w:sz w:val="16"/>
+              </w:rPr>
+              <w:t>Need External Validation; Need Real-world Deployment Evidence; Lack of Standardization; Need Clinical Decision Support</w:t>
+              <w:br/>
+              <w:t>Relevance: High for background and trend analysis</w:t>
+            </w:r>
+          </w:p>
+        </w:tc>
+      </w:tr>
+      <w:tr>
+        <w:tc>
+          <w:tcPr>
+            <w:tcW w:type="dxa" w:w="2340"/>
+            <w:vAlign w:val="top"/>
+          </w:tcPr>
+          <w:p>
+            <w:pPr>
+              <w:spacing w:after="0"/>
+            </w:pPr>
+            <w:r/>
+            <w:r>
+              <w:rPr>
+                <w:rFonts w:ascii="Calibri" w:hAnsi="Calibri"/>
+                <w:b w:val="0"/>
+                <w:sz w:val="16"/>
+              </w:rPr>
+              <w:t>Paper 35 (2025)</w:t>
+              <w:br/>
+              <w:t>Global trends in the use of artificial intelligence in reproductive medicine: insights from surveys of international fertility specialists</w:t>
+              <w:br/>
+              <w:t>Journal of IVF-Worldwide</w:t>
+            </w:r>
+          </w:p>
+        </w:tc>
+        <w:tc>
+          <w:tcPr>
+            <w:tcW w:type="dxa" w:w="2340"/>
+            <w:vAlign w:val="top"/>
+          </w:tcPr>
+          <w:p>
+            <w:pPr>
+              <w:spacing w:after="0"/>
+            </w:pPr>
+            <w:r/>
+            <w:r>
+              <w:rPr>
+                <w:rFonts w:ascii="Calibri" w:hAnsi="Calibri"/>
+                <w:b w:val="0"/>
+                <w:sz w:val="16"/>
+              </w:rPr>
+              <w:t>Assess global AI adoption and attitudes in reproductive medicine using surveys of fertility specialists.</w:t>
+              <w:br/>
+              <w:t>Method: Survey analysis.</w:t>
+            </w:r>
+          </w:p>
+        </w:tc>
+        <w:tc>
+          <w:tcPr>
+            <w:tcW w:type="dxa" w:w="2340"/>
+            <w:vAlign w:val="top"/>
+          </w:tcPr>
+          <w:p>
+            <w:pPr>
+              <w:spacing w:after="0"/>
+            </w:pPr>
+            <w:r/>
+            <w:r>
+              <w:rPr>
+                <w:rFonts w:ascii="Calibri" w:hAnsi="Calibri"/>
+                <w:b w:val="0"/>
+                <w:sz w:val="16"/>
+              </w:rPr>
+              <w:t>Survey data from 383 eligible respondents in 2022 and 171 primarily fertility-specialist respondents in 2025.</w:t>
+            </w:r>
+          </w:p>
+        </w:tc>
+        <w:tc>
+          <w:tcPr>
+            <w:tcW w:type="dxa" w:w="2340"/>
+            <w:vAlign w:val="top"/>
+          </w:tcPr>
+          <w:p>
+            <w:pPr>
+              <w:spacing w:after="0"/>
+            </w:pPr>
+            <w:r/>
+            <w:r>
+              <w:rPr>
+                <w:rFonts w:ascii="Calibri" w:hAnsi="Calibri"/>
+                <w:b w:val="0"/>
+                <w:sz w:val="16"/>
+              </w:rPr>
+              <w:t>Need Real-world Deployment Evidence; Trustworthy AI Gap; Clinical Utility Gap; Need Clinician Usability Evaluation</w:t>
+              <w:br/>
+              <w:t>Relevance: Medium-High for deployment context</w:t>
+            </w:r>
+          </w:p>
+        </w:tc>
+      </w:tr>
+    </w:tbl>
+    <w:p/>
     <w:sectPr>
       <w:pgSz w:w="12240" w:h="15840"/>
       <w:pgMar w:top="1440" w:right="1440" w:bottom="1440" w:left="1440" w:header="720" w:footer="720" w:gutter="0"/>

</xml_diff>